<commit_message>
Second-pass QA: Prasanna funnel precision (240 of 361), Poh TEC recall-miss disclosure replacing 'first LLM' claims, Tier-1 tagging described once as query-theme inheritance with 24/202 untagged + 71% any-tag disclosure, optimistic-errors hedged, physics-informed rise scoped with pool numbers, Wilson CIs on 42/88 and 8/88, standards cited with document symbols (GTR 20 / EVS-30-C01/Rev.4 / GB 38031-2025 / ISO 26262 / ISO-PAS 8800 / ISO 21448), Fig.4 crossref + caption fix, neutral venue wording, directional strong-to-weak sensitivity scenario added and script made self-reproducing, conference set labelled descriptive; response dossier section I
</commit_message>
<xml_diff>
--- a/ML-BMS-Review.docx
+++ b/ML-BMS-Review.docx
@@ -145,7 +145,7 @@
           <w:rFonts w:ascii="Times New Roman" w:hAnsi="Times New Roman"/>
           <w:sz w:val="20"/>
         </w:rPr>
-        <w:t>Union-share bibliometrics measured over the eligible corpus locate the screened literature’s center of gravity in health estimation (SOH, 20% of records), state estimation (SOC, 17%), and prognostics (13%), with charging control, thermal management, cell balancing, and vehicle- or fleet-level work comparatively thin for a transportation-electrification readership. Within the classified subset, method families stratify by period — classical shallow learners, then deep sequence models, now physics-informed hybrids (the only family with a monotonically non-decreasing primary-paper trajectory) — and the first large-language-model studies appear in 2025–2026.</w:t>
+        <w:t>Union-share bibliometrics measured over the eligible corpus locate the screened literature’s center of gravity in health estimation (SOH, 20% of records), state estimation (SOC, 17%), and prognostics (13%), with charging control, thermal management, cell balancing, and vehicle- or fleet-level work comparatively thin for a transportation-electrification readership. Within the classified subset, method families stratify by period — classical shallow learners, then deep sequence models, now physics-informed hybrids — a within-subset sequence that the eligible pool’s method-theme tags do not mirror (Section 3.2) — and the first large-language-model studies appear in 2025–2026.</w:t>
       </w:r>
     </w:p>
     <w:p>
@@ -158,7 +158,7 @@
           <w:rFonts w:ascii="Times New Roman" w:hAnsi="Times New Roman"/>
           <w:sz w:val="20"/>
         </w:rPr>
-        <w:t>Three structural weaknesses recur. Only 8 of the 88 primary-application papers demonstrate their estimators online or on real vehicle or fleet data; 17 rely on within-cell or k-fold splits that leak trajectory information; and the empirical base is split between three shared public benchmarks (23 papers on Severson/Toyota, NASA, and CALCE) and private laboratory cells (36 papers) that cannot be audited at all. Physics-informed architectures, often assumed more rigorous by construction, are not demonstrably so: neither stringency contrast with data-driven peers is statistically significant, and a label-noise sensitivity analysis brackets the strong-protocol share between 40% and 59%. The review closes with a requirement-level mapping of BMS functions onto UN GTR 20, GB 38031, and ISO 26262, a positioning against prior reviews, and a twelve-item reporting checklist; the complete evidence base and analysis pipeline are deposited with a DOI.</w:t>
+        <w:t>Three structural weaknesses recur. Only 8 of the 88 primary-application papers demonstrate their estimators online or on real vehicle or fleet data; 17 rely on within-cell or k-fold splits that leak trajectory information; and the empirical base is split between three shared public benchmarks (23 papers on Severson/Toyota, NASA, and CALCE) and private laboratory cells (36 papers) that cannot be audited at all. Physics-informed architectures, often assumed more rigorous by construction, are not demonstrably so: neither stringency contrast with data-driven peers is statistically significant, and label-noise scenario envelopes spanning both directions of the observed coder disagreement keep the strong-protocol share between 25% and 59%. The review closes with a requirement-level mapping of BMS functions onto UN GTR 20, GB 38031, and ISO 26262, a positioning against prior reviews, and a twelve-item reporting checklist; the complete evidence base and analysis pipeline are deposited with a DOI.</w:t>
       </w:r>
     </w:p>
     <w:p>
@@ -663,7 +663,7 @@
           <w:i w:val="0"/>
           <w:sz w:val="20"/>
         </w:rPr>
-        <w:t xml:space="preserve">, which systematically examines 240 peer-reviewed publications spanning the whole electric-vehicle powertrain — battery management alongside charging systems, motor control, and energy-consumption prediction — and aggregates reported performance metrics (RMSE, R²) into a quantitative benchmarking of algorithm families, concluding that hybrid deep-learning architectures (LSTM-DDQN, CNN-BiGRU, transformer-based frameworks) consistently achieve superior accuracy (R² &gt; 0.95, RMSE &lt; 0.05). This review differs from that work in scope, unit of analysis, and question asked. In scope, it is narrower and deeper: battery-management functions only — estimation, prognostics, charging, thermal, fault and safety, balancing — rather than the powertrain breadth, which permits function-level cuts such as the standards mapping of Section 9.4 and the per-function validation audit. In unit of analysis, it is protocol-centric rather than performance-centric: instead of pooling reported accuracy figures, it codes how each study’s validation protocol isolates (or fails to isolate) its generalization claim — cross-cell holdout versus within-cell splits, benchmark reuse versus private data, laboratory duty versus fleet duty. The two approaches are complementary, and the complementarity is pointed: an aggregation of self-reported RMSE and R² inherits, unmeasured, precisely the validation weaknesses that this review quantifies — 17 of 88 primary papers validate on information-leaking splits, and headline accuracies concentrate on three shared benchmarks — so where Prasanna et al. answer </w:t>
+        <w:t xml:space="preserve">, which examines 240 peer-reviewed publications (included from 361 initially retrieved records under its PRISMA screen) spanning the whole electric-vehicle powertrain — battery management alongside charging systems, motor control, and energy-consumption prediction — and aggregates reported performance metrics (RMSE, R²) into a quantitative benchmarking of algorithm families, concluding that hybrid deep-learning architectures (LSTM-DDQN, CNN-BiGRU, transformer-based frameworks) consistently achieve superior accuracy (R² &gt; 0.95, RMSE &lt; 0.05). This review differs from that work in scope, unit of analysis, and question asked. In scope, it is narrower and deeper: battery-management functions only — estimation, prognostics, charging, thermal, fault and safety, balancing — rather than the powertrain breadth, which permits function-level cuts such as the standards mapping of Section 9.4 and the per-function validation audit. In unit of analysis, it is protocol-centric rather than performance-centric: instead of pooling reported accuracy figures, it codes how each study’s validation protocol isolates (or fails to isolate) its generalization claim — cross-cell holdout versus within-cell splits, benchmark reuse versus private data, laboratory duty versus fleet duty. The two approaches are complementary, and the complementarity is pointed: an aggregation of self-reported RMSE and R² may inherit, unmeasured, precisely the validation weaknesses that this review quantifies within its own subset — there, 17 of 88 primary papers validate on information-leaking splits and headline accuracies concentrate on three shared benchmarks — so where Prasanna et al. answer </w:t>
       </w:r>
       <w:r>
         <w:rPr>
@@ -745,7 +745,55 @@
           <w:i w:val="0"/>
           <w:sz w:val="20"/>
         </w:rPr>
-        <w:t>This paper makes five contributions. First, it assembles a two-tier evidence base: a rule-based eligible corpus of 799 Crossref-verified journal articles from which field-level shares are measured within a documented capped retrieval, and an in-depth classified subset of 103 studies in which every reference’s bibliographic metadata was confirmed against the Crossref registry by direct DOI resolution. Second, it develops a classification framework — BMS function × method family, extended with chemistry, data-source, and validation-practice fields — applies it uniformly to all 103 papers, and probes its reliability with a blind 30-paper re-coding under a released codebook. Third, it quantifies the corpus’s composition across functions, methods, data, and validation (Section 3), anchoring function-level baselines on the quota-free eligible pool and reporting validation-practice rates with confidence intervals and label-noise sensitivity ranges. Fourth, it provides a critical, function-by-function review of what the corpus actually demonstrates (Sections 4–8), positioned explicitly against prior reviews (Section 9.7), and maps BMS functions onto UN GTR 20, GB 38031, and ISO 26262 requirements (Section 9.4). Fifth, it distills a gap-driven research agenda (Section 9) and a twelve-item reporting checklist (Section 9.9).</w:t>
+        <w:t xml:space="preserve">This paper makes five contributions. First, it assembles a two-tier evidence base: a rule-based eligible corpus of 799 Crossref-verified journal articles from which field-level shares are measured within a documented capped retrieval, and an in-depth classified subset of 103 studies in which every reference’s bibliographic metadata was confirmed against the Crossref registry by direct DOI resolution. Second, it develops a classification framework — BMS function × method family, extended with chemistry, data-source, and validation-practice fields — applies it uniformly to all 103 papers, and probes its reliability with a blind 30-paper re-coding under a released codebook. Third, it quantifies the corpus’s composition across functions, methods, data, and validation (Section 3), anchoring function-level baselines on the quota-free eligible pool and reporting validation-practice rates with confidence intervals and label-noise sensitivity ranges. Fourth, it provides a critical, function-by-function review of what the corpus actually demonstrates (Sections 4–8), positioned explicitly against prior reviews (Section 9.7), and maps BMS functions onto UN GTR 20 </w:t>
+      </w:r>
+      <w:r>
+        <w:rPr>
+          <w:rFonts w:ascii="Times New Roman" w:hAnsi="Times New Roman"/>
+          <w:sz w:val="20"/>
+        </w:rPr>
+        <w:t>[28]</w:t>
+      </w:r>
+      <w:r>
+        <w:rPr>
+          <w:rFonts w:ascii="Times New Roman" w:hAnsi="Times New Roman"/>
+          <w:b w:val="0"/>
+          <w:i w:val="0"/>
+          <w:sz w:val="20"/>
+        </w:rPr>
+        <w:t xml:space="preserve">, GB 38031 </w:t>
+      </w:r>
+      <w:r>
+        <w:rPr>
+          <w:rFonts w:ascii="Times New Roman" w:hAnsi="Times New Roman"/>
+          <w:sz w:val="20"/>
+        </w:rPr>
+        <w:t>[29]</w:t>
+      </w:r>
+      <w:r>
+        <w:rPr>
+          <w:rFonts w:ascii="Times New Roman" w:hAnsi="Times New Roman"/>
+          <w:b w:val="0"/>
+          <w:i w:val="0"/>
+          <w:sz w:val="20"/>
+        </w:rPr>
+        <w:t xml:space="preserve">, and ISO 26262 </w:t>
+      </w:r>
+      <w:r>
+        <w:rPr>
+          <w:rFonts w:ascii="Times New Roman" w:hAnsi="Times New Roman"/>
+          <w:sz w:val="20"/>
+        </w:rPr>
+        <w:t>[30]</w:t>
+      </w:r>
+      <w:r>
+        <w:rPr>
+          <w:rFonts w:ascii="Times New Roman" w:hAnsi="Times New Roman"/>
+          <w:b w:val="0"/>
+          <w:i w:val="0"/>
+          <w:sz w:val="20"/>
+        </w:rPr>
+        <w:t xml:space="preserve"> requirements (Section 9.4). Fifth, it distills a gap-driven research agenda (Section 9) and a twelve-item reporting checklist (Section 9.9).</w:t>
       </w:r>
     </w:p>
     <w:p>
@@ -1027,7 +1075,7 @@
           <w:i w:val="0"/>
           <w:sz w:val="20"/>
         </w:rPr>
-        <w:t xml:space="preserve"> Every one of the 799 eligible records is included, subject only to the venue screen — no function quotas, year caps, or citation thresholds are applied at this tier — and all 1,550 record-level screening decisions are released (screening_log.csv). Function tagging at Tier 1 is a rule-based keyword pass over titles with released term lists; its per-function union shares are the pool-level baselines used in Section 3.3, validated against the subset’s full-text primary-function labels (71% agreement; Section 2.5). </w:t>
+        <w:t xml:space="preserve"> Every one of the 799 eligible records is included, subject only to the venue screen — no function quotas, year caps, or citation thresholds are applied at this tier — and all 1,550 record-level screening decisions are released (screening_log.csv). Function tagging at Tier 1 is inherited from retrieval: each eligible record carries the area of every query theme that returned it (the released query list of Section 2.2), so a record can hold several tags, and per-tag union shares are the pool-level baselines used in Section 3.3. The limits of that scheme are disclosed here rather than footnoted. 24 of the 799 eligible records carry no tag beyond the generic ‘Other’ (the equivalent-circuit-modeling queries map to no area); 202 carry no core-function tag at all (methodological or cross-cutting themes only); and against the subset’s full-text function labels the tags match for 53 of the 75 core-area papers found in the pool (71%, counting a hit when any of a record’s tags matches — a lenient criterion). Pool-level function baselines are therefore retrieval-based indicators rather than classifications, and are read for ordering, not for exact rates. </w:t>
       </w:r>
       <w:r>
         <w:rPr>
@@ -1966,7 +2014,7 @@
           <w:i w:val="0"/>
           <w:sz w:val="20"/>
         </w:rPr>
-        <w:t xml:space="preserve"> tier (eligible corpus, 799 records), the capped retrieval captures 55, 85, 139, and 223 journal articles for 2020–2023, a documented retrieval hole totaling 56 in 2024 (Section 2.2), then 126 in 2025 and — partial year, retrieval date September 2026 — 114 in 2026, plus one further early-access record date-stamped 2027 by Crossref metadata and omitted from the year chart (Fig. 3, left panel). These are counts within a capped retrieval, not census totals, and they do not support absolute-growth claims: a per-year external denominator was tested and discarded, because Crossref’s reported result totals for the same queries rely on loose token-level bibliographic matches whose totals run into the hundreds of thousands and vary strongly with query phrasing, so they are not interpretable as field denominators (the test script and its output are released). What remains defensible is direction within the sample: the eligible-corpus counts rise through 2020–2023, dip at the retrieval hole, and remain high in 2025–2026.</w:t>
+        <w:t xml:space="preserve"> tier (eligible corpus, 799 records), the capped retrieval captures 55, 85, 139, and 223 journal articles for 2020–2023, a documented retrieval hole totaling 56 in 2024 (Section 2.2), then 126 in 2025 and — partial year, retrieval date September 2026 — 114 in 2026, plus one further early-access record date-stamped 2027 by Crossref metadata and omitted from the year chart (Fig. 4, left panel). These are counts within a capped retrieval, not census totals, and they do not support absolute-growth claims: a per-year external denominator was tested and discarded, because Crossref’s reported result totals for the same queries rely on loose token-level bibliographic matches whose totals run into the hundreds of thousands and vary strongly with query phrasing, so they are not interpretable as field denominators (the test script and its output are released). What remains defensible is direction within the sample: the eligible-corpus counts rise through 2020–2023, dip at the retrieval hole, and remain high in 2025–2026.</w:t>
       </w:r>
     </w:p>
     <w:p>
@@ -3130,7 +3178,7 @@
           <w:i w:val="0"/>
           <w:sz w:val="18"/>
         </w:rPr>
-        <w:t>Fig. 4 Method-family composition of the classified subset by publication year (paper counts; reviews shown as their own band). Yearly totals match the corpus totals of Table 3. Composition of the curated subset under the Section 2.3 quota design; not a field-level trend measurement (Section 3.2).</w:t>
+        <w:t>Fig. 4 Left panel: the measured eligible corpus per publication year (Tier 1, n = 799; capped retrieval, Section 3.1; one further record is date-stamped 2027 by Crossref and not shown). Right panel: method-family composition of the classified subset by publication year (Tier 2, paper counts; reviews shown as their own band); yearly totals match the corpus totals of Table 3. Composition of the curated subset under the Section 2.3 quota design; not a field-level trend measurement (Section 3.2).</w:t>
       </w:r>
     </w:p>
     <w:p>
@@ -3145,7 +3193,7 @@
           <w:i w:val="0"/>
           <w:sz w:val="20"/>
         </w:rPr>
-        <w:t>Three observations qualify this trajectory. First, the families are not mutually exclusive in practice — a PSO-tuned LSTM is simultaneously deep learning and optimization-augmented learning — and the corpus classification assigns each paper to its dominant family; the composition therefore understates method mixing. Second, the rise of physics-informed learning is partly a response to the recognized brittleness of purely data-driven models under distribution shift, but physics-informed papers in the corpus are, on average, validated no more stringently than others — if anything somewhat less stringently, a point quantified in Section 3.4. Third, the foundation-model cluster is too small to represent a trend; its significance is that LLM-based management (fleet risk analysis and LLM-based health estimation, Section 8.4) is appearing in mainstream energy journals at all. A pool-level cross-check bounds these observations: among the 799 eligible records, method-theme query tags show no monotonic physics-informed trend once the retrieval windows’ unequal year coverage is accounted for, so the family trajectories of this section describe the curated subset alone.</w:t>
+        <w:t>Three observations qualify this trajectory. First, the families are not mutually exclusive in practice — a PSO-tuned LSTM is simultaneously deep learning and optimization-augmented learning — and the corpus classification assigns each paper to its dominant family; the composition therefore understates method mixing. Second, the rise of physics-informed learning is partly a response to the recognized brittleness of purely data-driven models under distribution shift, but physics-informed papers in the corpus are, on average, validated no more stringently than others — if anything somewhat less stringently, a point quantified in Section 3.4. Third, the foundation-model cluster is too small to represent a trend; its significance is that LLM-based management (fleet risk analysis and LLM-based health estimation, Section 8.4) is appearing in mainstream energy journals at all. A pool-level cross-check bounds these observations: among the 799 eligible records, the physics-informed query theme tags 1, 10, 12, 18, 2, 3, and 9 records in 2020–2026 — 1.8%, 11.8%, 8.6%, 8.1%, 3.6%, 2.4%, and 7.9% of each year’s eligible records — non-monotonic and peaking in 2021, so no field-level physics-informed rise is measurable at either tier (the 2024 trough and the partial-year 2026 count both sit inside unequal retrieval windows), and the family trajectories of this section describe the curated subset alone.</w:t>
       </w:r>
     </w:p>
     <w:p>
@@ -3176,14 +3224,14 @@
           <w:i w:val="0"/>
           <w:sz w:val="20"/>
         </w:rPr>
-        <w:t xml:space="preserve">Functionally, the corpus is dominated by the health-prognostics complex: health estimation (20 papers) and remaining-useful-life prognostics (15) together account for 34% of the 103-paper corpus, followed by the cross-cutting cluster (24, including reviews, physics-informed methods, interpretability, transfer learning, digital twins, cloud/fleet themes, and foundation models), state estimation (17), fault and safety (9), charging control (8), thermal management (8), and cell balancing/ECM (2) (Fig. 5). Fig. 5 matches the all-corpus totals of Table 3 (103 papers); Fig. 1, by contrast, is drawn over the 88-paper primary-application corpus and excludes the 15 review-labelled papers, with the per-function reconciliation stated in that figure’s caption and in Table 3’s Reviews column. Because these shares are conditioned on the sampling quotas (Section 2.3), the quota-free eligible pool provides the check. Its query-theme tags — which reproduce the subset’s full-text primary-function label for 53 of the 75 core-area papers found in the pool (71%, counting a hit when any of a record’s tags matches; Section 2.5) — give health estimation 158, state estimation 133, prognostics 103, thermal management 99, fault and safety 96, charging control 64, and cell balancing 38 of 799 records. The pool confirms the same ordering at the top: the health-prognostics complex dominates, consistent with the commercial pull of lifetime prediction for warranties and second-life markets. It also confirms the same floor — balancing is the smallest core function at pool level as well as in the subset, so its thin representation is a property of the retrieved literature rather than an artifact of the quotas, and ML has so far contributed mainly at the level of pack-level insight rather than as a balancing controller — the corpus’s most-cited balancing-related result is the demonstration that routine balancing can be dispensed with in well-managed packs, reducing hazardous lithium-plating side reactions </w:t>
-      </w:r>
-      <w:r>
-        <w:rPr>
-          <w:rFonts w:ascii="Times New Roman" w:hAnsi="Times New Roman"/>
-          <w:sz w:val="20"/>
-        </w:rPr>
-        <w:t>[28]</w:t>
+        <w:t xml:space="preserve">Functionally, the corpus is dominated by the health-prognostics complex: health estimation (20 papers) and remaining-useful-life prognostics (15) together account for 34% of the 103-paper corpus, followed by the cross-cutting cluster (24, including reviews, physics-informed methods, interpretability, transfer learning, digital twins, cloud/fleet themes, and foundation models), state estimation (17), fault and safety (9), charging control (8), thermal management (8), and cell balancing/ECM (2) (Fig. 5). Fig. 5 matches the all-corpus totals of Table 3 (103 papers); Fig. 1, by contrast, is drawn over the 88-paper primary-application corpus and excludes the 15 review-labelled papers, with the per-function reconciliation stated in that figure’s caption and in Table 3’s Reviews column. Because these shares are conditioned on the sampling quotas (Section 2.3), the quota-free eligible pool provides the check. Its query-theme tags (their derivation, lenient validation, and untagged-record counts are disclosed in Section 2.3) give health estimation 158, state estimation 133, prognostics 103, thermal management 99, fault and safety 96, charging control 64, and cell balancing 38 of 799 records. The pool confirms the same ordering at the top: the health-prognostics complex dominates, consistent with the commercial pull of lifetime prediction for warranties and second-life markets. It also confirms the same floor — balancing is the smallest core function at pool level as well as in the subset, so its thin representation is a property of the retrieved literature rather than an artifact of the quotas, and ML has so far contributed mainly at the level of pack-level insight rather than as a balancing controller — the corpus’s most-cited balancing-related result is the demonstration that routine balancing can be dispensed with in well-managed packs, reducing hazardous lithium-plating side reactions </w:t>
+      </w:r>
+      <w:r>
+        <w:rPr>
+          <w:rFonts w:ascii="Times New Roman" w:hAnsi="Times New Roman"/>
+          <w:sz w:val="20"/>
+        </w:rPr>
+        <w:t>[31]</w:t>
       </w:r>
       <w:r>
         <w:rPr>
@@ -5692,7 +5740,7 @@
           <w:i w:val="0"/>
           <w:sz w:val="20"/>
         </w:rPr>
-        <w:t>Chemistry and venue concentration complete the corpus profile. NMC-type cells anchor 54 of the 103 studies and LFP 15; the remainder split across LCO, lithium-metal, lithium–sulfur, mixed panels, and unspecified chemistries — a distribution that mirrors EV market share but leaves sodium-ion, solid-state, and high-temperature systems nearly absent from the ML-management literature. Venue concentration is equally marked: the Journal of Energy Storage (15 papers), Energy (13), and Applied Energy (9) head the corpus, with Journal of Power Sources, Energy Storage Materials, and Reliability Engineering &amp; System Safety following; IEEE venues account for 7 of the 103 papers, three of them in IEEE Transactions on Transportation Electrification. The pool shows the same shape — Journal of Energy Storage 103, Energy 61, and Batteries 45 of 799 records, with IEEE-prefixed venues at 9.0% — so for readers the practical consequence is that the ML-BMS literature’s center of gravity sits in energy-systems journals rather than in machine-learning venues: partly a statement about where this work is reviewed and indexed, and partly a Crossref-registry artifact (Section 2.2), rather than evidence about how impact is achieved in this field. A final measured cut matters specifically for the transportation-electrification readership of this journal: only about 2% of eligible records (n = 17) carry fleet- or cloud-orchestration-adjacent tags, and in the classified subset only 10 of the 88 primary papers use real vehicle or fleet data as their primary source, against 36 resting on laboratory cells. The classified literature is thus predominantly cell-level and laboratory-scale — one integration level below the pack- and vehicle-level questions that UN GTR 20, GB 38031, and ISO 26262 pose; Section 9.4 maps that mismatch requirement by requirement.</w:t>
+        <w:t>Chemistry and venue concentration complete the corpus profile. NMC-type cells anchor 54 of the 103 studies and LFP 15; the remainder split across LCO, lithium-metal, lithium–sulfur, mixed panels, and unspecified chemistries — a distribution that mirrors EV market share but leaves sodium-ion, solid-state, and high-temperature systems nearly absent from the ML-management literature. Venue concentration is equally marked: the Journal of Energy Storage (15 papers), Energy (13), and Applied Energy (9) head the corpus, with Journal of Power Sources, Energy Storage Materials, and Reliability Engineering &amp; System Safety following; IEEE venues account for 7 of the 103 papers, three of them in IEEE Transactions on Transportation Electrification. The pool shows the same shape — Journal of Energy Storage 103, Energy 61, and Batteries 45 of 799 records, with IEEE-prefixed venues at 9.0% — so for readers the practical consequence is that the ML-BMS literature’s center of gravity sits in energy-systems journals rather than in machine-learning venues: partly a statement about where this work is reviewed and indexed, and partly a Crossref-registry artifact (Section 2.2), rather than evidence about how impact is achieved in this field. A final measured cut matters specifically for readers working on transportation electrification: only about 2% of eligible records (n = 17) carry fleet- or cloud-orchestration-adjacent tags, and in the classified subset only 10 of the 88 primary papers use real vehicle or fleet data as their primary source, against 36 resting on laboratory cells. The classified literature is thus predominantly cell-level and laboratory-scale — one integration level below the pack- and vehicle-level questions that UN GTR 20, GB 38031, and ISO 26262 pose; Section 9.4 maps that mismatch requirement by requirement.</w:t>
       </w:r>
     </w:p>
     <w:p>
@@ -5798,7 +5846,7 @@
           <w:i w:val="0"/>
           <w:sz w:val="20"/>
         </w:rPr>
-        <w:t xml:space="preserve"> is an online or real-vehicle demonstration; 12 are simulation-based; and 15 are reviews or perspectives that synthesize rather than generate data. Chemistry reporting is similarly skewed: 54 papers work on NMC-based cells, 15 on LFP, and the remainder on LCO, lithium-metal, lithium–sulfur, mixed panels, or unspecified chemistries.</w:t>
+        <w:t xml:space="preserve"> is an online or real-vehicle demonstration (9.1%; Wilson 95% CI 4.7–16.9%); 12 are simulation-based; and 15 are reviews or perspectives that synthesize rather than generate data. Chemistry reporting is similarly skewed: 54 papers work on NMC-based cells, 15 on LFP, and the remainder on LCO, lithium-metal, lithium–sulfur, mixed panels, or unspecified chemistries.</w:t>
       </w:r>
     </w:p>
     <w:p>
@@ -5831,7 +5879,7 @@
           <w:i w:val="0"/>
           <w:sz w:val="20"/>
         </w:rPr>
-        <w:t xml:space="preserve"> — cross-cell holdout (24 papers), cross-chemistry holdout (7), cross-domain holdout (3), and online or real-vehicle/fleet validation (8) — together cover 42 of the 88 primary-application papers (48%). At the weaker end, 12 papers use within-cell splits (training and testing on interleaved segments of the same cell’s life), 5 use k-fold cross-validation without cross-cell isolation, and 15 are reviews without primary validation; the remaining 29 primary papers establish an operating environment (experimental hardware, 20; simulation or case-study evidence, 9) without a data-isolation protocol. The complete per-paper protocol assignment is released (protocol_audit.csv, and the valid field of papers.csv), so the 42-of-88 arithmetic can be verified row by row, and the 30-paper blind re-coding of Section 2.5 re-derived 25 of these primary-paper assignments independently. Because fleet-data </w:t>
+        <w:t xml:space="preserve"> — cross-cell holdout (24 papers), cross-chemistry holdout (7), cross-domain holdout (3), and online or real-vehicle/fleet validation (8) — together cover 42 of the 88 primary-application papers (48%; Wilson 95% CI 37.6–58.0%). At the weaker end, 12 papers use within-cell splits (training and testing on interleaved segments of the same cell’s life), 5 use k-fold cross-validation without cross-cell isolation, and 15 are reviews without primary validation; the remaining 29 primary papers establish an operating environment (experimental hardware, 20; simulation or case-study evidence, 9) without a data-isolation protocol. The complete per-paper protocol assignment is released (protocol_audit.csv, and the valid field of papers.csv), so the 42-of-88 arithmetic can be verified row by row, and the 30-paper blind re-coding of Section 2.5 re-derived 25 of these primary-paper assignments independently. Because fleet-data </w:t>
       </w:r>
       <w:r>
         <w:rPr>
@@ -6597,7 +6645,7 @@
           <w:i w:val="0"/>
           <w:sz w:val="20"/>
         </w:rPr>
-        <w:t>Validation practice deserves its own cross-tabulation because it moderates every accuracy claim in the corpus (Table 5). Cross-cell holdout — training on some cells and testing on unseen siblings — is the strongest widely used laboratory protocol (24 papers), and the transfer protocols make the strictest demands (10 papers: 7 cross-chemistry, 3 cross-domain — the seven cross-chemistry validators are the studies behind the ‘validated across chemistries’ count of the preceding paragraph). At the weaker end, within-cell splits (12 papers) and unsupervised k-fold cross-validation (5 papers) leak trajectory information between train and test sets, producing optimistic errors that do not survive cell-to-cell variability; the review literature has long warned of this, and the corpus quantifies the warning. Experimental-hardware demonstrations (20 papers) and online or real-vehicle demonstrations (8 papers) anchor the deployment end of the spectrum, and it is these — not the largest architectures — that carry the field’s deployment evidence. Crossing validation practice with method family substantiates Section 3.2’s remark with numbers: 8 of the 22 physics-informed/hybrid primary papers (36%) use a strong protocol, against 34 of the 66 other primary papers (52%) — Fisher’s exact p = 0.32, odds ratio 0.54 (95% CI 0.21–1.46); under the broader definition of stringency (Section 2.5) that also counts experimental-hardware demonstrations, the contrast is 13 of 22 (59%) versus 49 of 66 (74%), p = 0.19. Neither difference is statistically significant. To quantify how much these counts depend on the single-coder labels, a label-noise scenario analysis perturbs them directly. In each of 4,000 seeded Monte Carlo draws (seed 7), a label-flip rate is drawn from a Normal distribution centered on the observed coder-versus-label bucket error rate of the reliability study (0.40 and 0.30 for the two coders; mean 0.35) with standard deviation 0.02, truncated at zero; the drawn rate then flips strong/non-strong bucket labels at random across the 88 primary papers, and both the overall strong share and the physics-versus-other Fisher exact test are recomputed. The strong-protocol count spans 35–52 of the 88 primary papers (39.8–59.1%), and the family contrast remains non-significant in 94.9% of draws — a physics prior does not, in itself, demonstrably buy validation rigor.</w:t>
+        <w:t>Validation practice deserves its own cross-tabulation because it moderates every accuracy claim in the corpus (Table 5). Cross-cell holdout — training on some cells and testing on unseen siblings — is the strongest widely used laboratory protocol (24 papers), and the transfer protocols make the strictest demands (10 papers: 7 cross-chemistry, 3 cross-domain — the seven cross-chemistry validators are the studies behind the ‘validated across chemistries’ count of the preceding paragraph). At the weaker end, within-cell splits (12 papers) and unsupervised k-fold cross-validation (5 papers) leak trajectory information between train and test sets and can thereby produce optimistic errors that need not survive cell-to-cell variability; the review literature has long warned of this, and the corpus quantifies how prevalent such splits are. Experimental-hardware demonstrations (20 papers) and online or real-vehicle demonstrations (8 papers) anchor the deployment end of the spectrum, and it is these — not the largest architectures — that carry the field’s deployment evidence. Crossing validation practice with method family substantiates Section 3.2’s remark with numbers: 8 of the 22 physics-informed/hybrid primary papers (36%) use a strong protocol, against 34 of the 66 other primary papers (52%) — Fisher’s exact p = 0.32, odds ratio 0.54 (95% CI 0.21–1.46); under the broader definition of stringency (Section 2.5) that also counts experimental-hardware demonstrations, the contrast is 13 of 22 (59%) versus 49 of 66 (74%), p = 0.19. Neither difference is statistically significant. To quantify how much these counts depend on the single-coder labels, a label-noise scenario analysis perturbs them directly. The analysis is a scenario envelope, not an error model. In each of 4,000 seeded Monte Carlo draws (seed 7), a label-flip rate is drawn from a Normal distribution centered on the observed coder-versus-label bucket error rate of the reliability study (0.37 and 0.27 for the two coders; mean 0.32) with standard deviation 0.02, truncated at zero; the drawn rate then flips strong/non-strong bucket labels across the 88 primary papers, and both the overall strong share and the physics-versus-other Fisher exact test are recomputed. Two readings are built into the design. Symmetric random flipping — in either direction — mechanically attenuates contrasts toward the null, whereas the actually observed coder-label disagreements are directional: 16 of the 19 bucket disagreements have the coder assigning weak where the released label says strong, the declared conservative fallback of Section 2.5. A second scenario therefore flips strong labels to weak only, at the same drawn rates, matching that direction. Under the symmetric scenario the strong-protocol count spans 35–52 of the 88 primary papers (39.8–59.1%) and the family contrast remains non-significant in 94.4% of draws; under the strong-to-weak-only scenario the count spans 22–35 (25.0–39.8%) and the contrast remains non-significant in 96.3% of draws. Read together, the two scenarios bound the single-coder counts on both sides of the documented disagreement structure — under either, a physics prior does not demonstrably buy validation rigor.</w:t>
       </w:r>
     </w:p>
     <w:p>
@@ -6936,7 +6984,7 @@
                 <w:i w:val="0"/>
                 <w:sz w:val="17"/>
               </w:rPr>
-              <w:t>Optimistic; trajectory leakage between train and test</w:t>
+              <w:t>Can be optimistic; trajectory leakage between train and test</w:t>
             </w:r>
           </w:p>
         </w:tc>
@@ -7122,7 +7170,7 @@
                 <w:i w:val="0"/>
                 <w:sz w:val="17"/>
               </w:rPr>
-              <w:t>Optimistic without cell-level isolation</w:t>
+              <w:t>Can be optimistic without cell-level isolation</w:t>
             </w:r>
           </w:p>
         </w:tc>
@@ -7791,7 +7839,7 @@
           <w:i w:val="0"/>
           <w:sz w:val="20"/>
         </w:rPr>
-        <w:t>3.5 Sensitivity analysis: does the journal-only corpus understate validation practice?</w:t>
+        <w:t>3.5 Conference-venue check (descriptive): does the journal-only corpus understate validation practice?</w:t>
       </w:r>
     </w:p>
     <w:p>
@@ -7806,7 +7854,7 @@
           <w:i w:val="0"/>
           <w:sz w:val="20"/>
         </w:rPr>
-        <w:t>Because the corpus excludes conference proceedings — a major venue for control-oriented BMS work (CDC, ACC, IFAC, VPPC, ITEC) — the validation findings of Section 3.4 could in principle be an artifact of venue selection: if conference papers systematically demonstrate more hardware and hardware-in-the-loop validation than journals, the journal-only sample would understate the field’s actual practice. To test this, we curated a sensitivity set of 14 battery papers from six control and transportation-electrification venues (ACC, ECC, CCDC, APEC, VPPC, ITEC, 2019–2025), retrieved by venue-scoped Crossref queries, restricted to proceedings articles, ranked by citation count, and verified by the same DOI-resolution procedure as the main corpus (released in full as conference_sensitivity.csv). A pre-stated inclusion rule was then applied mechanically to all retrieved proceedings papers (Table 7 lists all 14 with the rule's outcome): a paper enters the learning-path comparison only if machine learning is a substantive component of its contribution. Under this rule 8 of the 14 qualify; the remainder are conventional model-based estimators (Kalman-filter variants, multiple-model adaptive estimation, batch least squares), an EKF-critique, and one overview, and all 14 are released so that the rule can be audited rather than trusted. Validation practice was classified conservatively from the indexed abstracts into four classes: hardware/experimental stated, public dataset, simulation-level, and not stated.</w:t>
+        <w:t>Because the corpus excludes conference proceedings — a major venue for control-oriented BMS work (CDC, ACC, IFAC, VPPC, ITEC) — the validation findings of Section 3.4 could in principle be an artifact of venue selection: if conference papers systematically demonstrate more hardware and hardware-in-the-loop validation than journals, the journal-only sample would understate the field’s actual practice. To test this, we curated a sensitivity set of 14 battery papers from six control and transportation-electrification venues (ACC, ECC, CCDC, APEC, VPPC, ITEC, 2019–2025), retrieved by venue-scoped Crossref queries, restricted to proceedings articles, ranked by citation count, and verified by the same DOI-resolution procedure as the main corpus (released in full as conference_sensitivity.csv). The comparison is descriptive and abstract-level throughout — indexed abstracts versus the full-text coding of the main corpus — so it is reported as a labelled descriptive check rather than a validated sensitivity analysis, and none of its counts enter the headline statistics of Section 3.4. A pre-stated inclusion rule was then applied mechanically to all retrieved proceedings papers (Table 7 lists all 14 with the rule's outcome): a paper enters the learning-path comparison only if machine learning is a substantive component of its contribution. Under this rule 8 of the 14 qualify; the remainder are conventional model-based estimators (Kalman-filter variants, multiple-model adaptive estimation, batch least squares), an EKF-critique, and one overview, and all 14 are released so that the rule can be audited rather than trusted. Validation practice was classified conservatively from the indexed abstracts into four classes: hardware/experimental stated, public dataset, simulation-level, and not stated.</w:t>
       </w:r>
     </w:p>
     <w:p>
@@ -8006,7 +8054,7 @@
                 <w:rFonts w:ascii="Times New Roman" w:hAnsi="Times New Roman"/>
                 <w:sz w:val="17"/>
               </w:rPr>
-              <w:t>[29]</w:t>
+              <w:t>[32]</w:t>
             </w:r>
           </w:p>
         </w:tc>
@@ -8112,7 +8160,7 @@
                 <w:rFonts w:ascii="Times New Roman" w:hAnsi="Times New Roman"/>
                 <w:sz w:val="17"/>
               </w:rPr>
-              <w:t>[30]</w:t>
+              <w:t>[33]</w:t>
             </w:r>
           </w:p>
         </w:tc>
@@ -8218,7 +8266,7 @@
                 <w:rFonts w:ascii="Times New Roman" w:hAnsi="Times New Roman"/>
                 <w:sz w:val="17"/>
               </w:rPr>
-              <w:t>[31]</w:t>
+              <w:t>[34]</w:t>
             </w:r>
           </w:p>
         </w:tc>
@@ -8321,7 +8369,7 @@
                 <w:rFonts w:ascii="Times New Roman" w:hAnsi="Times New Roman"/>
                 <w:sz w:val="17"/>
               </w:rPr>
-              <w:t>[32]</w:t>
+              <w:t>[35]</w:t>
             </w:r>
           </w:p>
         </w:tc>
@@ -8424,7 +8472,7 @@
                 <w:rFonts w:ascii="Times New Roman" w:hAnsi="Times New Roman"/>
                 <w:sz w:val="17"/>
               </w:rPr>
-              <w:t>[33]</w:t>
+              <w:t>[36]</w:t>
             </w:r>
           </w:p>
         </w:tc>
@@ -8530,7 +8578,7 @@
                 <w:rFonts w:ascii="Times New Roman" w:hAnsi="Times New Roman"/>
                 <w:sz w:val="17"/>
               </w:rPr>
-              <w:t>[34]</w:t>
+              <w:t>[37]</w:t>
             </w:r>
           </w:p>
         </w:tc>
@@ -8636,7 +8684,7 @@
                 <w:rFonts w:ascii="Times New Roman" w:hAnsi="Times New Roman"/>
                 <w:sz w:val="17"/>
               </w:rPr>
-              <w:t>[35]</w:t>
+              <w:t>[38]</w:t>
             </w:r>
           </w:p>
         </w:tc>
@@ -8742,7 +8790,7 @@
                 <w:rFonts w:ascii="Times New Roman" w:hAnsi="Times New Roman"/>
                 <w:sz w:val="17"/>
               </w:rPr>
-              <w:t>[36]</w:t>
+              <w:t>[39]</w:t>
             </w:r>
           </w:p>
         </w:tc>
@@ -8845,7 +8893,7 @@
                 <w:rFonts w:ascii="Times New Roman" w:hAnsi="Times New Roman"/>
                 <w:sz w:val="17"/>
               </w:rPr>
-              <w:t>[37]</w:t>
+              <w:t>[40]</w:t>
             </w:r>
           </w:p>
         </w:tc>
@@ -8951,7 +8999,7 @@
                 <w:rFonts w:ascii="Times New Roman" w:hAnsi="Times New Roman"/>
                 <w:sz w:val="17"/>
               </w:rPr>
-              <w:t>[38]</w:t>
+              <w:t>[41]</w:t>
             </w:r>
           </w:p>
         </w:tc>
@@ -9054,7 +9102,7 @@
                 <w:rFonts w:ascii="Times New Roman" w:hAnsi="Times New Roman"/>
                 <w:sz w:val="17"/>
               </w:rPr>
-              <w:t>[39]</w:t>
+              <w:t>[42]</w:t>
             </w:r>
           </w:p>
         </w:tc>
@@ -9154,7 +9202,7 @@
                 <w:rFonts w:ascii="Times New Roman" w:hAnsi="Times New Roman"/>
                 <w:sz w:val="17"/>
               </w:rPr>
-              <w:t>[40]</w:t>
+              <w:t>[43]</w:t>
             </w:r>
           </w:p>
         </w:tc>
@@ -9257,7 +9305,7 @@
                 <w:rFonts w:ascii="Times New Roman" w:hAnsi="Times New Roman"/>
                 <w:sz w:val="17"/>
               </w:rPr>
-              <w:t>[41]</w:t>
+              <w:t>[44]</w:t>
             </w:r>
           </w:p>
         </w:tc>
@@ -9363,7 +9411,7 @@
                 <w:rFonts w:ascii="Times New Roman" w:hAnsi="Times New Roman"/>
                 <w:sz w:val="17"/>
               </w:rPr>
-              <w:t>[42]</w:t>
+              <w:t>[45]</w:t>
             </w:r>
           </w:p>
         </w:tc>
@@ -9475,7 +9523,7 @@
           <w:rFonts w:ascii="Times New Roman" w:hAnsi="Times New Roman"/>
           <w:sz w:val="20"/>
         </w:rPr>
-        <w:t>[43]</w:t>
+        <w:t>[46]</w:t>
       </w:r>
       <w:r>
         <w:rPr>
@@ -9507,7 +9555,7 @@
           <w:rFonts w:ascii="Times New Roman" w:hAnsi="Times New Roman"/>
           <w:sz w:val="20"/>
         </w:rPr>
-        <w:t>[44]</w:t>
+        <w:t>[47]</w:t>
       </w:r>
       <w:r>
         <w:rPr>
@@ -9523,7 +9571,7 @@
           <w:rFonts w:ascii="Times New Roman" w:hAnsi="Times New Roman"/>
           <w:sz w:val="20"/>
         </w:rPr>
-        <w:t>[45]</w:t>
+        <w:t>[48]</w:t>
       </w:r>
       <w:r>
         <w:rPr>
@@ -9570,7 +9618,7 @@
           <w:rFonts w:ascii="Times New Roman" w:hAnsi="Times New Roman"/>
           <w:sz w:val="20"/>
         </w:rPr>
-        <w:t>[46]</w:t>
+        <w:t>[49]</w:t>
       </w:r>
       <w:r>
         <w:rPr>
@@ -9586,7 +9634,7 @@
           <w:rFonts w:ascii="Times New Roman" w:hAnsi="Times New Roman"/>
           <w:sz w:val="20"/>
         </w:rPr>
-        <w:t>[47]</w:t>
+        <w:t>[50]</w:t>
       </w:r>
       <w:r>
         <w:rPr>
@@ -9602,7 +9650,7 @@
           <w:rFonts w:ascii="Times New Roman" w:hAnsi="Times New Roman"/>
           <w:sz w:val="20"/>
         </w:rPr>
-        <w:t>[48]</w:t>
+        <w:t>[51]</w:t>
       </w:r>
       <w:r>
         <w:rPr>
@@ -9618,7 +9666,7 @@
           <w:rFonts w:ascii="Times New Roman" w:hAnsi="Times New Roman"/>
           <w:sz w:val="20"/>
         </w:rPr>
-        <w:t>[49]</w:t>
+        <w:t>[52]</w:t>
       </w:r>
       <w:r>
         <w:rPr>
@@ -9634,7 +9682,7 @@
           <w:rFonts w:ascii="Times New Roman" w:hAnsi="Times New Roman"/>
           <w:sz w:val="20"/>
         </w:rPr>
-        <w:t>[50]</w:t>
+        <w:t>[53]</w:t>
       </w:r>
       <w:r>
         <w:rPr>
@@ -9650,7 +9698,7 @@
           <w:rFonts w:ascii="Times New Roman" w:hAnsi="Times New Roman"/>
           <w:sz w:val="20"/>
         </w:rPr>
-        <w:t>[51, 52]</w:t>
+        <w:t>[54, 55]</w:t>
       </w:r>
       <w:r>
         <w:rPr>
@@ -9728,7 +9776,7 @@
           <w:rFonts w:ascii="Times New Roman" w:hAnsi="Times New Roman"/>
           <w:sz w:val="20"/>
         </w:rPr>
-        <w:t>[53]</w:t>
+        <w:t>[56]</w:t>
       </w:r>
       <w:r>
         <w:rPr>
@@ -9744,7 +9792,7 @@
           <w:rFonts w:ascii="Times New Roman" w:hAnsi="Times New Roman"/>
           <w:sz w:val="20"/>
         </w:rPr>
-        <w:t>[54]</w:t>
+        <w:t>[57]</w:t>
       </w:r>
       <w:r>
         <w:rPr>
@@ -9807,7 +9855,7 @@
           <w:rFonts w:ascii="Times New Roman" w:hAnsi="Times New Roman"/>
           <w:sz w:val="20"/>
         </w:rPr>
-        <w:t>[49]</w:t>
+        <w:t>[52]</w:t>
       </w:r>
       <w:r>
         <w:rPr>
@@ -9854,7 +9902,7 @@
           <w:rFonts w:ascii="Times New Roman" w:hAnsi="Times New Roman"/>
           <w:sz w:val="20"/>
         </w:rPr>
-        <w:t>[54]</w:t>
+        <w:t>[57]</w:t>
       </w:r>
       <w:r>
         <w:rPr>
@@ -9870,7 +9918,7 @@
           <w:rFonts w:ascii="Times New Roman" w:hAnsi="Times New Roman"/>
           <w:sz w:val="20"/>
         </w:rPr>
-        <w:t>[55]</w:t>
+        <w:t>[58]</w:t>
       </w:r>
       <w:r>
         <w:rPr>
@@ -9933,7 +9981,7 @@
           <w:rFonts w:ascii="Times New Roman" w:hAnsi="Times New Roman"/>
           <w:sz w:val="20"/>
         </w:rPr>
-        <w:t>[56]</w:t>
+        <w:t>[59]</w:t>
       </w:r>
       <w:r>
         <w:rPr>
@@ -9949,7 +9997,7 @@
           <w:rFonts w:ascii="Times New Roman" w:hAnsi="Times New Roman"/>
           <w:sz w:val="20"/>
         </w:rPr>
-        <w:t>[57]</w:t>
+        <w:t>[60]</w:t>
       </w:r>
       <w:r>
         <w:rPr>
@@ -9965,7 +10013,7 @@
           <w:rFonts w:ascii="Times New Roman" w:hAnsi="Times New Roman"/>
           <w:sz w:val="20"/>
         </w:rPr>
-        <w:t>[58]</w:t>
+        <w:t>[61]</w:t>
       </w:r>
       <w:r>
         <w:rPr>
@@ -9981,7 +10029,7 @@
           <w:rFonts w:ascii="Times New Roman" w:hAnsi="Times New Roman"/>
           <w:sz w:val="20"/>
         </w:rPr>
-        <w:t>[59]</w:t>
+        <w:t>[62]</w:t>
       </w:r>
       <w:r>
         <w:rPr>
@@ -9997,7 +10045,7 @@
           <w:rFonts w:ascii="Times New Roman" w:hAnsi="Times New Roman"/>
           <w:sz w:val="20"/>
         </w:rPr>
-        <w:t>[60]</w:t>
+        <w:t>[63]</w:t>
       </w:r>
       <w:r>
         <w:rPr>
@@ -10013,7 +10061,7 @@
           <w:rFonts w:ascii="Times New Roman" w:hAnsi="Times New Roman"/>
           <w:sz w:val="20"/>
         </w:rPr>
-        <w:t>[61]</w:t>
+        <w:t>[64]</w:t>
       </w:r>
       <w:r>
         <w:rPr>
@@ -10044,7 +10092,7 @@
           <w:rFonts w:ascii="Times New Roman" w:hAnsi="Times New Roman"/>
           <w:sz w:val="20"/>
         </w:rPr>
-        <w:t>[61]</w:t>
+        <w:t>[64]</w:t>
       </w:r>
       <w:r>
         <w:rPr>
@@ -10123,7 +10171,7 @@
           <w:rFonts w:ascii="Times New Roman" w:hAnsi="Times New Roman"/>
           <w:sz w:val="20"/>
         </w:rPr>
-        <w:t>[62]</w:t>
+        <w:t>[65]</w:t>
       </w:r>
       <w:r>
         <w:rPr>
@@ -10139,7 +10187,7 @@
           <w:rFonts w:ascii="Times New Roman" w:hAnsi="Times New Roman"/>
           <w:sz w:val="20"/>
         </w:rPr>
-        <w:t>[63]</w:t>
+        <w:t>[66]</w:t>
       </w:r>
       <w:r>
         <w:rPr>
@@ -10155,7 +10203,7 @@
           <w:rFonts w:ascii="Times New Roman" w:hAnsi="Times New Roman"/>
           <w:sz w:val="20"/>
         </w:rPr>
-        <w:t>[64]</w:t>
+        <w:t>[67]</w:t>
       </w:r>
       <w:r>
         <w:rPr>
@@ -10187,7 +10235,7 @@
           <w:rFonts w:ascii="Times New Roman" w:hAnsi="Times New Roman"/>
           <w:sz w:val="20"/>
         </w:rPr>
-        <w:t>[65]</w:t>
+        <w:t>[68]</w:t>
       </w:r>
       <w:r>
         <w:rPr>
@@ -10203,7 +10251,7 @@
           <w:rFonts w:ascii="Times New Roman" w:hAnsi="Times New Roman"/>
           <w:sz w:val="20"/>
         </w:rPr>
-        <w:t>[66]</w:t>
+        <w:t>[69]</w:t>
       </w:r>
       <w:r>
         <w:rPr>
@@ -10266,7 +10314,7 @@
           <w:rFonts w:ascii="Times New Roman" w:hAnsi="Times New Roman"/>
           <w:sz w:val="20"/>
         </w:rPr>
-        <w:t>[67]</w:t>
+        <w:t>[70]</w:t>
       </w:r>
       <w:r>
         <w:rPr>
@@ -10282,7 +10330,7 @@
           <w:rFonts w:ascii="Times New Roman" w:hAnsi="Times New Roman"/>
           <w:sz w:val="20"/>
         </w:rPr>
-        <w:t>[68]</w:t>
+        <w:t>[71]</w:t>
       </w:r>
       <w:r>
         <w:rPr>
@@ -10298,7 +10346,7 @@
           <w:rFonts w:ascii="Times New Roman" w:hAnsi="Times New Roman"/>
           <w:sz w:val="20"/>
         </w:rPr>
-        <w:t>[69]</w:t>
+        <w:t>[72]</w:t>
       </w:r>
       <w:r>
         <w:rPr>
@@ -10314,7 +10362,7 @@
           <w:rFonts w:ascii="Times New Roman" w:hAnsi="Times New Roman"/>
           <w:sz w:val="20"/>
         </w:rPr>
-        <w:t>[70]</w:t>
+        <w:t>[73]</w:t>
       </w:r>
       <w:r>
         <w:rPr>
@@ -10330,7 +10378,7 @@
           <w:rFonts w:ascii="Times New Roman" w:hAnsi="Times New Roman"/>
           <w:sz w:val="20"/>
         </w:rPr>
-        <w:t>[71]</w:t>
+        <w:t>[74]</w:t>
       </w:r>
       <w:r>
         <w:rPr>
@@ -10392,7 +10440,7 @@
           <w:rFonts w:ascii="Times New Roman" w:hAnsi="Times New Roman"/>
           <w:sz w:val="20"/>
         </w:rPr>
-        <w:t>[72]</w:t>
+        <w:t>[75]</w:t>
       </w:r>
       <w:r>
         <w:rPr>
@@ -10408,7 +10456,7 @@
           <w:rFonts w:ascii="Times New Roman" w:hAnsi="Times New Roman"/>
           <w:sz w:val="20"/>
         </w:rPr>
-        <w:t>[73]</w:t>
+        <w:t>[76]</w:t>
       </w:r>
       <w:r>
         <w:rPr>
@@ -10424,7 +10472,7 @@
           <w:rFonts w:ascii="Times New Roman" w:hAnsi="Times New Roman"/>
           <w:sz w:val="20"/>
         </w:rPr>
-        <w:t>[74]</w:t>
+        <w:t>[77]</w:t>
       </w:r>
       <w:r>
         <w:rPr>
@@ -10440,7 +10488,7 @@
           <w:rFonts w:ascii="Times New Roman" w:hAnsi="Times New Roman"/>
           <w:sz w:val="20"/>
         </w:rPr>
-        <w:t>[75]</w:t>
+        <w:t>[78]</w:t>
       </w:r>
       <w:r>
         <w:rPr>
@@ -10456,7 +10504,7 @@
           <w:rFonts w:ascii="Times New Roman" w:hAnsi="Times New Roman"/>
           <w:sz w:val="20"/>
         </w:rPr>
-        <w:t>[76]</w:t>
+        <w:t>[79]</w:t>
       </w:r>
       <w:r>
         <w:rPr>
@@ -10472,7 +10520,7 @@
           <w:rFonts w:ascii="Times New Roman" w:hAnsi="Times New Roman"/>
           <w:sz w:val="20"/>
         </w:rPr>
-        <w:t>[77]</w:t>
+        <w:t>[80]</w:t>
       </w:r>
       <w:r>
         <w:rPr>
@@ -10488,7 +10536,7 @@
           <w:rFonts w:ascii="Times New Roman" w:hAnsi="Times New Roman"/>
           <w:sz w:val="20"/>
         </w:rPr>
-        <w:t>[78]</w:t>
+        <w:t>[81]</w:t>
       </w:r>
       <w:r>
         <w:rPr>
@@ -10583,7 +10631,7 @@
           <w:rFonts w:ascii="Times New Roman" w:hAnsi="Times New Roman"/>
           <w:sz w:val="20"/>
         </w:rPr>
-        <w:t>[79]</w:t>
+        <w:t>[82]</w:t>
       </w:r>
       <w:r>
         <w:rPr>
@@ -10599,7 +10647,7 @@
           <w:rFonts w:ascii="Times New Roman" w:hAnsi="Times New Roman"/>
           <w:sz w:val="20"/>
         </w:rPr>
-        <w:t>[80]</w:t>
+        <w:t>[83]</w:t>
       </w:r>
       <w:r>
         <w:rPr>
@@ -10615,7 +10663,7 @@
           <w:rFonts w:ascii="Times New Roman" w:hAnsi="Times New Roman"/>
           <w:sz w:val="20"/>
         </w:rPr>
-        <w:t>[81]</w:t>
+        <w:t>[84]</w:t>
       </w:r>
       <w:r>
         <w:rPr>
@@ -10631,7 +10679,7 @@
           <w:rFonts w:ascii="Times New Roman" w:hAnsi="Times New Roman"/>
           <w:sz w:val="20"/>
         </w:rPr>
-        <w:t>[82]</w:t>
+        <w:t>[85]</w:t>
       </w:r>
       <w:r>
         <w:rPr>
@@ -10804,7 +10852,7 @@
           <w:rFonts w:ascii="Times New Roman" w:hAnsi="Times New Roman"/>
           <w:sz w:val="20"/>
         </w:rPr>
-        <w:t>[83]</w:t>
+        <w:t>[86]</w:t>
       </w:r>
       <w:r>
         <w:rPr>
@@ -10820,7 +10868,7 @@
           <w:rFonts w:ascii="Times New Roman" w:hAnsi="Times New Roman"/>
           <w:sz w:val="20"/>
         </w:rPr>
-        <w:t>[84]</w:t>
+        <w:t>[87]</w:t>
       </w:r>
       <w:r>
         <w:rPr>
@@ -10867,7 +10915,7 @@
           <w:rFonts w:ascii="Times New Roman" w:hAnsi="Times New Roman"/>
           <w:sz w:val="20"/>
         </w:rPr>
-        <w:t>[85]</w:t>
+        <w:t>[88]</w:t>
       </w:r>
       <w:r>
         <w:rPr>
@@ -10883,7 +10931,7 @@
           <w:rFonts w:ascii="Times New Roman" w:hAnsi="Times New Roman"/>
           <w:sz w:val="20"/>
         </w:rPr>
-        <w:t>[86]</w:t>
+        <w:t>[89]</w:t>
       </w:r>
       <w:r>
         <w:rPr>
@@ -10899,7 +10947,7 @@
           <w:rFonts w:ascii="Times New Roman" w:hAnsi="Times New Roman"/>
           <w:sz w:val="20"/>
         </w:rPr>
-        <w:t>[87]</w:t>
+        <w:t>[90]</w:t>
       </w:r>
       <w:r>
         <w:rPr>
@@ -10915,7 +10963,7 @@
           <w:rFonts w:ascii="Times New Roman" w:hAnsi="Times New Roman"/>
           <w:sz w:val="20"/>
         </w:rPr>
-        <w:t>[88]</w:t>
+        <w:t>[91]</w:t>
       </w:r>
       <w:r>
         <w:rPr>
@@ -10931,7 +10979,7 @@
           <w:rFonts w:ascii="Times New Roman" w:hAnsi="Times New Roman"/>
           <w:sz w:val="20"/>
         </w:rPr>
-        <w:t>[89]</w:t>
+        <w:t>[92]</w:t>
       </w:r>
       <w:r>
         <w:rPr>
@@ -10962,7 +11010,7 @@
           <w:rFonts w:ascii="Times New Roman" w:hAnsi="Times New Roman"/>
           <w:sz w:val="20"/>
         </w:rPr>
-        <w:t>[87]</w:t>
+        <w:t>[90]</w:t>
       </w:r>
       <w:r>
         <w:rPr>
@@ -10978,7 +11026,7 @@
           <w:rFonts w:ascii="Times New Roman" w:hAnsi="Times New Roman"/>
           <w:sz w:val="20"/>
         </w:rPr>
-        <w:t>[88]</w:t>
+        <w:t>[91]</w:t>
       </w:r>
       <w:r>
         <w:rPr>
@@ -11041,7 +11089,7 @@
           <w:rFonts w:ascii="Times New Roman" w:hAnsi="Times New Roman"/>
           <w:sz w:val="20"/>
         </w:rPr>
-        <w:t>[85]</w:t>
+        <w:t>[88]</w:t>
       </w:r>
       <w:r>
         <w:rPr>
@@ -11223,7 +11271,7 @@
                 <w:rFonts w:ascii="Times New Roman" w:hAnsi="Times New Roman"/>
                 <w:sz w:val="17"/>
               </w:rPr>
-              <w:t>[46]</w:t>
+              <w:t>[49]</w:t>
             </w:r>
             <w:r>
               <w:rPr>
@@ -11239,7 +11287,7 @@
                 <w:rFonts w:ascii="Times New Roman" w:hAnsi="Times New Roman"/>
                 <w:sz w:val="17"/>
               </w:rPr>
-              <w:t>[53]</w:t>
+              <w:t>[56]</w:t>
             </w:r>
           </w:p>
         </w:tc>
@@ -11305,7 +11353,7 @@
                 <w:rFonts w:ascii="Times New Roman" w:hAnsi="Times New Roman"/>
                 <w:sz w:val="17"/>
               </w:rPr>
-              <w:t>[61]</w:t>
+              <w:t>[64]</w:t>
             </w:r>
             <w:r>
               <w:rPr>
@@ -11321,7 +11369,7 @@
                 <w:rFonts w:ascii="Times New Roman" w:hAnsi="Times New Roman"/>
                 <w:sz w:val="17"/>
               </w:rPr>
-              <w:t>[66]</w:t>
+              <w:t>[69]</w:t>
             </w:r>
             <w:r>
               <w:rPr>
@@ -11419,7 +11467,7 @@
                 <w:rFonts w:ascii="Times New Roman" w:hAnsi="Times New Roman"/>
                 <w:sz w:val="17"/>
               </w:rPr>
-              <w:t>[76]</w:t>
+              <w:t>[79]</w:t>
             </w:r>
             <w:r>
               <w:rPr>
@@ -11517,7 +11565,7 @@
                 <w:rFonts w:ascii="Times New Roman" w:hAnsi="Times New Roman"/>
                 <w:sz w:val="17"/>
               </w:rPr>
-              <w:t>[85]</w:t>
+              <w:t>[88]</w:t>
             </w:r>
             <w:r>
               <w:rPr>
@@ -11533,7 +11581,7 @@
                 <w:rFonts w:ascii="Times New Roman" w:hAnsi="Times New Roman"/>
                 <w:sz w:val="17"/>
               </w:rPr>
-              <w:t>[83]</w:t>
+              <w:t>[86]</w:t>
             </w:r>
           </w:p>
         </w:tc>
@@ -11599,7 +11647,7 @@
                 <w:rFonts w:ascii="Times New Roman" w:hAnsi="Times New Roman"/>
                 <w:sz w:val="17"/>
               </w:rPr>
-              <w:t>[90]</w:t>
+              <w:t>[93]</w:t>
             </w:r>
             <w:r>
               <w:rPr>
@@ -11631,7 +11679,7 @@
                 <w:rFonts w:ascii="Times New Roman" w:hAnsi="Times New Roman"/>
                 <w:sz w:val="17"/>
               </w:rPr>
-              <w:t>[91]</w:t>
+              <w:t>[94]</w:t>
             </w:r>
           </w:p>
         </w:tc>
@@ -11697,7 +11745,7 @@
                 <w:rFonts w:ascii="Times New Roman" w:hAnsi="Times New Roman"/>
                 <w:sz w:val="17"/>
               </w:rPr>
-              <w:t>[92]</w:t>
+              <w:t>[95]</w:t>
             </w:r>
             <w:r>
               <w:rPr>
@@ -11713,7 +11761,7 @@
                 <w:rFonts w:ascii="Times New Roman" w:hAnsi="Times New Roman"/>
                 <w:sz w:val="17"/>
               </w:rPr>
-              <w:t>[93]</w:t>
+              <w:t>[96]</w:t>
             </w:r>
             <w:r>
               <w:rPr>
@@ -11729,7 +11777,7 @@
                 <w:rFonts w:ascii="Times New Roman" w:hAnsi="Times New Roman"/>
                 <w:sz w:val="17"/>
               </w:rPr>
-              <w:t>[94]</w:t>
+              <w:t>[97]</w:t>
             </w:r>
           </w:p>
         </w:tc>
@@ -11811,32 +11859,32 @@
                 <w:rFonts w:ascii="Times New Roman" w:hAnsi="Times New Roman"/>
                 <w:sz w:val="17"/>
               </w:rPr>
-              <w:t>[95]</w:t>
-            </w:r>
-            <w:r>
-              <w:rPr>
-                <w:rFonts w:ascii="Times New Roman" w:hAnsi="Times New Roman"/>
-                <w:b w:val="0"/>
-                <w:i w:val="0"/>
-                <w:sz w:val="17"/>
-              </w:rPr>
-              <w:t xml:space="preserve">; LLM-based SOH estimation with uncertainty-aware field-vehicle control (field data; subset’s earliest LLM estimator; earlier LLM-based estimation exists outside the screened venues </w:t>
-            </w:r>
-            <w:r>
-              <w:rPr>
-                <w:rFonts w:ascii="Times New Roman" w:hAnsi="Times New Roman"/>
-                <w:sz w:val="17"/>
-              </w:rPr>
-              <w:t>[96]</w:t>
-            </w:r>
-            <w:r>
-              <w:rPr>
-                <w:rFonts w:ascii="Times New Roman" w:hAnsi="Times New Roman"/>
-                <w:b w:val="0"/>
-                <w:i w:val="0"/>
-                <w:sz w:val="17"/>
-              </w:rPr>
-              <w:t xml:space="preserve">) </w:t>
+              <w:t>[98]</w:t>
+            </w:r>
+            <w:r>
+              <w:rPr>
+                <w:rFonts w:ascii="Times New Roman" w:hAnsi="Times New Roman"/>
+                <w:b w:val="0"/>
+                <w:i w:val="0"/>
+                <w:sz w:val="17"/>
+              </w:rPr>
+              <w:t xml:space="preserve">; LLM-based SOH estimation with uncertainty-aware field-vehicle control (field data; subset’s earliest LLM estimator; an earlier journal LLM estimator was missed by this review’s retrieval </w:t>
+            </w:r>
+            <w:r>
+              <w:rPr>
+                <w:rFonts w:ascii="Times New Roman" w:hAnsi="Times New Roman"/>
+                <w:sz w:val="17"/>
+              </w:rPr>
+              <w:t>[99]</w:t>
+            </w:r>
+            <w:r>
+              <w:rPr>
+                <w:rFonts w:ascii="Times New Roman" w:hAnsi="Times New Roman"/>
+                <w:b w:val="0"/>
+                <w:i w:val="0"/>
+                <w:sz w:val="17"/>
+              </w:rPr>
+              <w:t xml:space="preserve"> (Section 8.4)) </w:t>
             </w:r>
             <w:r>
               <w:rPr>
@@ -11906,7 +11954,7 @@
           <w:rFonts w:ascii="Times New Roman" w:hAnsi="Times New Roman"/>
           <w:sz w:val="20"/>
         </w:rPr>
-        <w:t>[90]</w:t>
+        <w:t>[93]</w:t>
       </w:r>
       <w:r>
         <w:rPr>
@@ -11922,7 +11970,7 @@
           <w:rFonts w:ascii="Times New Roman" w:hAnsi="Times New Roman"/>
           <w:sz w:val="20"/>
         </w:rPr>
-        <w:t>[97]</w:t>
+        <w:t>[100]</w:t>
       </w:r>
       <w:r>
         <w:rPr>
@@ -11938,7 +11986,7 @@
           <w:rFonts w:ascii="Times New Roman" w:hAnsi="Times New Roman"/>
           <w:sz w:val="20"/>
         </w:rPr>
-        <w:t>[91, 98]</w:t>
+        <w:t>[94, 101]</w:t>
       </w:r>
       <w:r>
         <w:rPr>
@@ -11954,7 +12002,7 @@
           <w:rFonts w:ascii="Times New Roman" w:hAnsi="Times New Roman"/>
           <w:sz w:val="20"/>
         </w:rPr>
-        <w:t>[99]</w:t>
+        <w:t>[102]</w:t>
       </w:r>
       <w:r>
         <w:rPr>
@@ -11970,7 +12018,7 @@
           <w:rFonts w:ascii="Times New Roman" w:hAnsi="Times New Roman"/>
           <w:sz w:val="20"/>
         </w:rPr>
-        <w:t>[100]</w:t>
+        <w:t>[103]</w:t>
       </w:r>
       <w:r>
         <w:rPr>
@@ -12085,7 +12133,7 @@
           <w:rFonts w:ascii="Times New Roman" w:hAnsi="Times New Roman"/>
           <w:sz w:val="20"/>
         </w:rPr>
-        <w:t>[91, 98]</w:t>
+        <w:t>[94, 101]</w:t>
       </w:r>
       <w:r>
         <w:rPr>
@@ -12119,7 +12167,7 @@
           <w:rFonts w:ascii="Times New Roman" w:hAnsi="Times New Roman"/>
           <w:sz w:val="20"/>
         </w:rPr>
-        <w:t>[100]</w:t>
+        <w:t>[103]</w:t>
       </w:r>
       <w:r>
         <w:rPr>
@@ -12166,7 +12214,7 @@
           <w:rFonts w:ascii="Times New Roman" w:hAnsi="Times New Roman"/>
           <w:sz w:val="20"/>
         </w:rPr>
-        <w:t>[92]</w:t>
+        <w:t>[95]</w:t>
       </w:r>
       <w:r>
         <w:rPr>
@@ -12182,7 +12230,7 @@
           <w:rFonts w:ascii="Times New Roman" w:hAnsi="Times New Roman"/>
           <w:sz w:val="20"/>
         </w:rPr>
-        <w:t>[101]</w:t>
+        <w:t>[104]</w:t>
       </w:r>
       <w:r>
         <w:rPr>
@@ -12198,7 +12246,7 @@
           <w:rFonts w:ascii="Times New Roman" w:hAnsi="Times New Roman"/>
           <w:sz w:val="20"/>
         </w:rPr>
-        <w:t>[102]</w:t>
+        <w:t>[105]</w:t>
       </w:r>
       <w:r>
         <w:rPr>
@@ -12214,7 +12262,7 @@
           <w:rFonts w:ascii="Times New Roman" w:hAnsi="Times New Roman"/>
           <w:sz w:val="20"/>
         </w:rPr>
-        <w:t>[103]</w:t>
+        <w:t>[106]</w:t>
       </w:r>
       <w:r>
         <w:rPr>
@@ -12230,7 +12278,7 @@
           <w:rFonts w:ascii="Times New Roman" w:hAnsi="Times New Roman"/>
           <w:sz w:val="20"/>
         </w:rPr>
-        <w:t>[93]</w:t>
+        <w:t>[96]</w:t>
       </w:r>
       <w:r>
         <w:rPr>
@@ -12246,7 +12294,7 @@
           <w:rFonts w:ascii="Times New Roman" w:hAnsi="Times New Roman"/>
           <w:sz w:val="20"/>
         </w:rPr>
-        <w:t>[104]</w:t>
+        <w:t>[107]</w:t>
       </w:r>
       <w:r>
         <w:rPr>
@@ -12262,7 +12310,7 @@
           <w:rFonts w:ascii="Times New Roman" w:hAnsi="Times New Roman"/>
           <w:sz w:val="20"/>
         </w:rPr>
-        <w:t>[94]</w:t>
+        <w:t>[97]</w:t>
       </w:r>
       <w:r>
         <w:rPr>
@@ -12309,7 +12357,7 @@
           <w:rFonts w:ascii="Times New Roman" w:hAnsi="Times New Roman"/>
           <w:sz w:val="20"/>
         </w:rPr>
-        <w:t>[104]</w:t>
+        <w:t>[107]</w:t>
       </w:r>
       <w:r>
         <w:rPr>
@@ -12381,14 +12429,14 @@
           <w:i w:val="0"/>
           <w:sz w:val="20"/>
         </w:rPr>
-        <w:t xml:space="preserve">Physics-informed and hybrid model–data learning is the corpus’s most consistently rising methodological theme (24 family-coded papers across all functions; 22 of them primary applications; the only family with a monotonically non-decreasing primary trajectory within the curated subset, Section 3.2). Beyond the prognostics applications of Section 5.4, physics-informed structures appear in state estimation </w:t>
-      </w:r>
-      <w:r>
-        <w:rPr>
-          <w:rFonts w:ascii="Times New Roman" w:hAnsi="Times New Roman"/>
-          <w:sz w:val="20"/>
-        </w:rPr>
-        <w:t>[10, 105]</w:t>
+        <w:t xml:space="preserve">Within the classified subset, physics-informed and hybrid model–data learning is the most consistently rising methodological theme (24 family-coded papers across all functions; 22 of them primary applications; the only family with a monotonically non-decreasing primary trajectory within the subset — a pattern the eligible pool’s query-theme tags do not mirror, Section 3.2). Beyond the prognostics applications of Section 5.4, physics-informed structures appear in state estimation </w:t>
+      </w:r>
+      <w:r>
+        <w:rPr>
+          <w:rFonts w:ascii="Times New Roman" w:hAnsi="Times New Roman"/>
+          <w:sz w:val="20"/>
+        </w:rPr>
+        <w:t>[10, 108]</w:t>
       </w:r>
       <w:r>
         <w:rPr>
@@ -12436,7 +12484,7 @@
           <w:rFonts w:ascii="Times New Roman" w:hAnsi="Times New Roman"/>
           <w:sz w:val="20"/>
         </w:rPr>
-        <w:t>[106]</w:t>
+        <w:t>[109]</w:t>
       </w:r>
       <w:r>
         <w:rPr>
@@ -12452,7 +12500,7 @@
           <w:rFonts w:ascii="Times New Roman" w:hAnsi="Times New Roman"/>
           <w:sz w:val="20"/>
         </w:rPr>
-        <w:t>[107]</w:t>
+        <w:t>[110]</w:t>
       </w:r>
       <w:r>
         <w:rPr>
@@ -12468,7 +12516,7 @@
           <w:rFonts w:ascii="Times New Roman" w:hAnsi="Times New Roman"/>
           <w:sz w:val="20"/>
         </w:rPr>
-        <w:t>[108]</w:t>
+        <w:t>[111]</w:t>
       </w:r>
       <w:r>
         <w:rPr>
@@ -12533,7 +12581,7 @@
           <w:rFonts w:ascii="Times New Roman" w:hAnsi="Times New Roman"/>
           <w:sz w:val="20"/>
         </w:rPr>
-        <w:t>[109]</w:t>
+        <w:t>[112]</w:t>
       </w:r>
       <w:r>
         <w:rPr>
@@ -12549,7 +12597,7 @@
           <w:rFonts w:ascii="Times New Roman" w:hAnsi="Times New Roman"/>
           <w:sz w:val="20"/>
         </w:rPr>
-        <w:t>[110]</w:t>
+        <w:t>[113]</w:t>
       </w:r>
       <w:r>
         <w:rPr>
@@ -12565,7 +12613,7 @@
           <w:rFonts w:ascii="Times New Roman" w:hAnsi="Times New Roman"/>
           <w:sz w:val="20"/>
         </w:rPr>
-        <w:t>[111]</w:t>
+        <w:t>[114]</w:t>
       </w:r>
       <w:r>
         <w:rPr>
@@ -12581,7 +12629,7 @@
           <w:rFonts w:ascii="Times New Roman" w:hAnsi="Times New Roman"/>
           <w:sz w:val="20"/>
         </w:rPr>
-        <w:t>[95]</w:t>
+        <w:t>[98]</w:t>
       </w:r>
       <w:r>
         <w:rPr>
@@ -12628,7 +12676,7 @@
           <w:rFonts w:ascii="Times New Roman" w:hAnsi="Times New Roman"/>
           <w:sz w:val="20"/>
         </w:rPr>
-        <w:t>[56]</w:t>
+        <w:t>[59]</w:t>
       </w:r>
       <w:r>
         <w:rPr>
@@ -12644,7 +12692,7 @@
           <w:rFonts w:ascii="Times New Roman" w:hAnsi="Times New Roman"/>
           <w:sz w:val="20"/>
         </w:rPr>
-        <w:t>[95]</w:t>
+        <w:t>[98]</w:t>
       </w:r>
       <w:r>
         <w:rPr>
@@ -12727,7 +12775,7 @@
           <w:rFonts w:ascii="Times New Roman" w:hAnsi="Times New Roman"/>
           <w:sz w:val="20"/>
         </w:rPr>
-        <w:t>[112]</w:t>
+        <w:t>[115]</w:t>
       </w:r>
       <w:r>
         <w:rPr>
@@ -12743,7 +12791,7 @@
           <w:rFonts w:ascii="Times New Roman" w:hAnsi="Times New Roman"/>
           <w:sz w:val="20"/>
         </w:rPr>
-        <w:t>[113]</w:t>
+        <w:t>[116]</w:t>
       </w:r>
       <w:r>
         <w:rPr>
@@ -12759,7 +12807,7 @@
           <w:rFonts w:ascii="Times New Roman" w:hAnsi="Times New Roman"/>
           <w:sz w:val="20"/>
         </w:rPr>
-        <w:t>[114]</w:t>
+        <w:t>[117]</w:t>
       </w:r>
       <w:r>
         <w:rPr>
@@ -12775,7 +12823,7 @@
           <w:rFonts w:ascii="Times New Roman" w:hAnsi="Times New Roman"/>
           <w:sz w:val="20"/>
         </w:rPr>
-        <w:t>[115]</w:t>
+        <w:t>[118]</w:t>
       </w:r>
       <w:r>
         <w:rPr>
@@ -12791,7 +12839,7 @@
           <w:rFonts w:ascii="Times New Roman" w:hAnsi="Times New Roman"/>
           <w:sz w:val="20"/>
         </w:rPr>
-        <w:t>[55]</w:t>
+        <w:t>[58]</w:t>
       </w:r>
       <w:r>
         <w:rPr>
@@ -12807,7 +12855,7 @@
           <w:rFonts w:ascii="Times New Roman" w:hAnsi="Times New Roman"/>
           <w:sz w:val="20"/>
         </w:rPr>
-        <w:t>[54, 116]</w:t>
+        <w:t>[57, 119]</w:t>
       </w:r>
       <w:r>
         <w:rPr>
@@ -12823,7 +12871,7 @@
           <w:rFonts w:ascii="Times New Roman" w:hAnsi="Times New Roman"/>
           <w:sz w:val="20"/>
         </w:rPr>
-        <w:t>[117]</w:t>
+        <w:t>[120]</w:t>
       </w:r>
       <w:r>
         <w:rPr>
@@ -12854,7 +12902,7 @@
           <w:rFonts w:ascii="Times New Roman" w:hAnsi="Times New Roman"/>
           <w:sz w:val="20"/>
         </w:rPr>
-        <w:t>[112]</w:t>
+        <w:t>[115]</w:t>
       </w:r>
       <w:r>
         <w:rPr>
@@ -12870,7 +12918,7 @@
           <w:rFonts w:ascii="Times New Roman" w:hAnsi="Times New Roman"/>
           <w:sz w:val="20"/>
         </w:rPr>
-        <w:t>[114]</w:t>
+        <w:t>[117]</w:t>
       </w:r>
       <w:r>
         <w:rPr>
@@ -12886,7 +12934,7 @@
           <w:rFonts w:ascii="Times New Roman" w:hAnsi="Times New Roman"/>
           <w:sz w:val="20"/>
         </w:rPr>
-        <w:t>[115]</w:t>
+        <w:t>[118]</w:t>
       </w:r>
       <w:r>
         <w:rPr>
@@ -12958,7 +13006,23 @@
           <w:i w:val="0"/>
           <w:sz w:val="20"/>
         </w:rPr>
-        <w:t>, is an LLM-based SOH estimator: it aligns resampled charging-current sequences with the LLM embedding space, injects battery degradation priors through prefix adaptation, and — most notably for safety — wraps the LLM in an uncertainty-aware module that estimates predictive uncertainty by Monte Carlo sampling and selectively substitutes a physics-consistent estimator when uncertainty is high. It is validated on one year of field data from 100 production vehicles on a vehicle-cloud platform, with an independent teardown and bench capacity calibration on an unseen vehicle model, and it remains robust in few-shot and zero-shot cross-vehicle evaluations. The published work therefore already spans both the orchestration seat and the estimator seat, and the estimator-seat study is instructive precisely because its authors treated hallucination risk as a design constraint: uncertainty-triggered fallback to a physics-consistent estimator is exactly the guardrail this review argues should be mandatory (Table 9). The appearance of both roles in mainstream energy journals in 2025–2026 marks a new phase: the management stack is beginning to absorb foundation-model components.</w:t>
+        <w:t xml:space="preserve">, is an LLM-based SOH estimator: it aligns resampled charging-current sequences with the LLM embedding space, injects battery degradation priors through prefix adaptation, and — most notably for safety — wraps the LLM in an uncertainty-aware module that estimates predictive uncertainty by Monte Carlo sampling and selectively substitutes a physics-consistent estimator when uncertainty is high. It is validated on one year of field data from 100 production vehicles on a vehicle-cloud platform, with an independent teardown and bench capacity calibration on an unseen vehicle model, and it remains robust in few-shot and zero-shot cross-vehicle evaluations. The published work therefore already spans both the orchestration seat and the estimator seat, and the estimator-seat study is instructive precisely because its authors treated hallucination risk as a design constraint: uncertainty-triggered fallback to a physics-consistent estimator is exactly the guardrail this review argues should be mandatory (Table 9). The appearance of both roles in mainstream energy journals in 2025–2026 marks a new phase: the management stack is beginning to absorb foundation-model components. Earliest-here claims are bounded by retrieval: a GPT-4-based health estimator by Poh et al. </w:t>
+      </w:r>
+      <w:r>
+        <w:rPr>
+          <w:rFonts w:ascii="Times New Roman" w:hAnsi="Times New Roman"/>
+          <w:sz w:val="20"/>
+        </w:rPr>
+        <w:t>[99]</w:t>
+      </w:r>
+      <w:r>
+        <w:rPr>
+          <w:rFonts w:ascii="Times New Roman" w:hAnsi="Times New Roman"/>
+          <w:b w:val="0"/>
+          <w:i w:val="0"/>
+          <w:sz w:val="20"/>
+        </w:rPr>
+        <w:t xml:space="preserve"> appeared in IEEE Transactions on Energy Conversion in 2025, predating both studies, and it appears nowhere in the released 1,550-record retrieval — a recall miss of the query design (Section 2.2), not a venue exclusion. Studies in this subset are therefore described as the earliest in the classified subset, not the first in the field.</w:t>
       </w:r>
     </w:p>
     <w:p>
@@ -12973,7 +13037,7 @@
           <w:i w:val="0"/>
           <w:sz w:val="20"/>
         </w:rPr>
-        <w:t xml:space="preserve">Because BMS software is safety-critical, this review argues for an explicit division of labor before that absorption goes further, and Table 9 makes it concrete. The table contrasts established practice for classical and deep learning estimators with what the corpus’s two LLM studies actually demonstrate, and states the guardrails this review regards as mandatory before any LLM component touches a safety-relevant path. The right-hand column is normative guidance proposed here, not claims about the published studies. The notable point is that the field’s first LLM estimator study </w:t>
+        <w:t xml:space="preserve">Because BMS software is safety-critical, this review argues for an explicit division of labor before that absorption goes further, and Table 9 makes it concrete. The table contrasts established practice for classical and deep learning estimators with what the corpus’s two LLM studies actually demonstrate, and states the guardrails this review regards as mandatory before any LLM component touches a safety-relevant path. The right-hand column is normative guidance proposed here, not claims about the published studies. The notable point is that the subset’s earliest LLM estimator study </w:t>
       </w:r>
       <w:r>
         <w:rPr>
@@ -13215,23 +13279,23 @@
                 <w:i w:val="0"/>
                 <w:sz w:val="17"/>
               </w:rPr>
-              <w:t xml:space="preserve"> is the earliest in the screened subset — LLM-based battery estimation exists earlier outside these venues </w:t>
-            </w:r>
-            <w:r>
-              <w:rPr>
-                <w:rFonts w:ascii="Times New Roman" w:hAnsi="Times New Roman"/>
-                <w:sz w:val="17"/>
-              </w:rPr>
-              <w:t>[96]</w:t>
-            </w:r>
-            <w:r>
-              <w:rPr>
-                <w:rFonts w:ascii="Times New Roman" w:hAnsi="Times New Roman"/>
-                <w:b w:val="0"/>
-                <w:i w:val="0"/>
-                <w:sz w:val="17"/>
-              </w:rPr>
-              <w:t xml:space="preserve"> — and must show calibrated intervals before any actuation-adjacent role</w:t>
+              <w:t xml:space="preserve"> is the earliest in the classified subset — an earlier journal-published LLM estimator, missed by this review’s retrieval, is </w:t>
+            </w:r>
+            <w:r>
+              <w:rPr>
+                <w:rFonts w:ascii="Times New Roman" w:hAnsi="Times New Roman"/>
+                <w:sz w:val="17"/>
+              </w:rPr>
+              <w:t>[99]</w:t>
+            </w:r>
+            <w:r>
+              <w:rPr>
+                <w:rFonts w:ascii="Times New Roman" w:hAnsi="Times New Roman"/>
+                <w:b w:val="0"/>
+                <w:i w:val="0"/>
+                <w:sz w:val="17"/>
+              </w:rPr>
+              <w:t xml:space="preserve"> (Section 8.4) — and must show calibrated intervals before any actuation-adjacent role</w:t>
             </w:r>
           </w:p>
         </w:tc>
@@ -13681,7 +13745,7 @@
           <w:rFonts w:ascii="Times New Roman" w:hAnsi="Times New Roman"/>
           <w:sz w:val="20"/>
         </w:rPr>
-        <w:t>[118]</w:t>
+        <w:t>[121]</w:t>
       </w:r>
       <w:r>
         <w:rPr>
@@ -13697,7 +13761,7 @@
           <w:rFonts w:ascii="Times New Roman" w:hAnsi="Times New Roman"/>
           <w:sz w:val="20"/>
         </w:rPr>
-        <w:t>[110]</w:t>
+        <w:t>[113]</w:t>
       </w:r>
       <w:r>
         <w:rPr>
@@ -13713,7 +13777,7 @@
           <w:rFonts w:ascii="Times New Roman" w:hAnsi="Times New Roman"/>
           <w:sz w:val="20"/>
         </w:rPr>
-        <w:t>[103]</w:t>
+        <w:t>[106]</w:t>
       </w:r>
       <w:r>
         <w:rPr>
@@ -13729,7 +13793,7 @@
           <w:rFonts w:ascii="Times New Roman" w:hAnsi="Times New Roman"/>
           <w:sz w:val="20"/>
         </w:rPr>
-        <w:t>[28]</w:t>
+        <w:t>[31]</w:t>
       </w:r>
       <w:r>
         <w:rPr>
@@ -13745,7 +13809,7 @@
           <w:rFonts w:ascii="Times New Roman" w:hAnsi="Times New Roman"/>
           <w:sz w:val="20"/>
         </w:rPr>
-        <w:t>[119]</w:t>
+        <w:t>[122]</w:t>
       </w:r>
       <w:r>
         <w:rPr>
@@ -13816,14 +13880,14 @@
           <w:i w:val="0"/>
           <w:sz w:val="20"/>
         </w:rPr>
-        <w:t xml:space="preserve">The corpus’s validation data are unambiguous: 17 of the 88 primary papers use within-cell splits or unsupervised k-folds, and only 8 of the 88 demonstrate their systems online or on real fleets. Until cross-cell, cross-temperature, and cross-protocol holdout protocols become reporting norms, published accuracy figures will keep overstating deployable performance. The most valuable near-term contribution the community can make is standardized transfer protocols — train-on-chemistry-A/test-on-chemistry-B, train-on-lab/test-on-fleet — reported alongside headline accuracy, as already practiced by the transfer-learning and general-framework studies </w:t>
-      </w:r>
-      <w:r>
-        <w:rPr>
-          <w:rFonts w:ascii="Times New Roman" w:hAnsi="Times New Roman"/>
-          <w:sz w:val="20"/>
-        </w:rPr>
-        <w:t>[80, 81]</w:t>
+        <w:t xml:space="preserve">The corpus’s validation data are unambiguous: 17 of the 88 primary papers use within-cell splits or unsupervised k-folds, and only 8 of the 88 demonstrate their systems online or on real fleets. Until cross-cell, cross-temperature, and cross-protocol holdout protocols become reporting norms, published accuracy figures will continue to carry a systematic risk of overstating deployable performance. The most valuable near-term contribution the community can make is standardized transfer protocols — train-on-chemistry-A/test-on-chemistry-B, train-on-lab/test-on-fleet — reported alongside headline accuracy, as already practiced by the transfer-learning and general-framework studies </w:t>
+      </w:r>
+      <w:r>
+        <w:rPr>
+          <w:rFonts w:ascii="Times New Roman" w:hAnsi="Times New Roman"/>
+          <w:sz w:val="20"/>
+        </w:rPr>
+        <w:t>[83, 84]</w:t>
       </w:r>
       <w:r>
         <w:rPr>
@@ -13885,7 +13949,7 @@
           <w:rFonts w:ascii="Times New Roman" w:hAnsi="Times New Roman"/>
           <w:sz w:val="20"/>
         </w:rPr>
-        <w:t>[61]</w:t>
+        <w:t>[64]</w:t>
       </w:r>
       <w:r>
         <w:rPr>
@@ -13916,7 +13980,7 @@
           <w:rFonts w:ascii="Times New Roman" w:hAnsi="Times New Roman"/>
           <w:sz w:val="20"/>
         </w:rPr>
-        <w:t>[71, 82]</w:t>
+        <w:t>[74, 85]</w:t>
       </w:r>
       <w:r>
         <w:rPr>
@@ -13963,7 +14027,7 @@
           <w:rFonts w:ascii="Times New Roman" w:hAnsi="Times New Roman"/>
           <w:sz w:val="20"/>
         </w:rPr>
-        <w:t>[71]</w:t>
+        <w:t>[74]</w:t>
       </w:r>
       <w:r>
         <w:rPr>
@@ -13979,7 +14043,7 @@
           <w:rFonts w:ascii="Times New Roman" w:hAnsi="Times New Roman"/>
           <w:sz w:val="20"/>
         </w:rPr>
-        <w:t>[82]</w:t>
+        <w:t>[85]</w:t>
       </w:r>
       <w:r>
         <w:rPr>
@@ -14042,7 +14106,7 @@
           <w:rFonts w:ascii="Times New Roman" w:hAnsi="Times New Roman"/>
           <w:sz w:val="20"/>
         </w:rPr>
-        <w:t>[95]</w:t>
+        <w:t>[98]</w:t>
       </w:r>
       <w:r>
         <w:rPr>
@@ -14058,7 +14122,7 @@
           <w:rFonts w:ascii="Times New Roman" w:hAnsi="Times New Roman"/>
           <w:sz w:val="20"/>
         </w:rPr>
-        <w:t>[109]</w:t>
+        <w:t>[112]</w:t>
       </w:r>
       <w:r>
         <w:rPr>
@@ -14074,7 +14138,7 @@
           <w:rFonts w:ascii="Times New Roman" w:hAnsi="Times New Roman"/>
           <w:sz w:val="20"/>
         </w:rPr>
-        <w:t>[56]</w:t>
+        <w:t>[59]</w:t>
       </w:r>
       <w:r>
         <w:rPr>
@@ -14098,7 +14162,103 @@
           <w:i w:val="0"/>
           <w:sz w:val="20"/>
         </w:rPr>
-        <w:t xml:space="preserve">The safety standards invoked in the introduction — UN GTR 20 (electric-vehicle safety; its Amendment 1 on thermal propagation, endorsed for WP.29 adoption in late 2026 at this review’s retrieval date, offers two compliance paths: a physical test, or a risk-management approach inspired by ISO 26262 and ISO 6469-1), GB 38031 (GB 38031-2020, in force through mid-2026, and the strengthened GB 38031-2025, effective July 2026, which replaces the fire/explosion-warning criterion with no-fire/no-explosion thermal-diffusion requirements and adds bottom-impact and fast-charge-cycle tests), ISO 26262:2018 (functional safety of road-vehicle E/E systems), ISO/PAS 8800:2024 (safety and artificial intelligence — the road-vehicle extension of ISO 26262 and ISO 21448 to learned components), and ISO 21448 (SOTIF) — do not prescribe estimation algorithms, but they define what a deployed estimator or controller must be able to evidence, and Table 10 translates the subset’s gaps into those terms. The mapping is this review’s synthesis at requirement level rather than clause level, and it is stated so that it can be checked against the standards texts themselves: the point is not legal advice but that a validation protocol reported in a paper corresponds, or does not, to evidence a safety case can use. The inference rule behind every ‘supports a standards argument’ statement in this section is explicit: a paper’s evidence can support such an argument only if it demonstrates performance on at least one held-out integration unit (a cross-cell holdout or stronger isolation protocol, Section 2.5) and reports the environment in which that evidence was obtained; by construction, within-cell and k-fold evidence cannot support the argument, because the safety case is about unseen cells and unseen duty. Three consequences stand out for automotive deployment. Within-cell and k-fold validation (17 primary papers) cannot support an ISO 26262 argument, because the safety case is about unseen cells and unseen duty and the protocol never tests an unseen unit; a standards argument must therefore be </w:t>
+        <w:t xml:space="preserve">The safety standards invoked in the introduction — UN GTR No. 20 on electric-vehicle safety (established in the UN Global Registry in 2018 </w:t>
+      </w:r>
+      <w:r>
+        <w:rPr>
+          <w:rFonts w:ascii="Times New Roman" w:hAnsi="Times New Roman"/>
+          <w:sz w:val="20"/>
+        </w:rPr>
+        <w:t>[28]</w:t>
+      </w:r>
+      <w:r>
+        <w:rPr>
+          <w:rFonts w:ascii="Times New Roman" w:hAnsi="Times New Roman"/>
+          <w:b w:val="0"/>
+          <w:i w:val="0"/>
+          <w:sz w:val="20"/>
+        </w:rPr>
+        <w:t xml:space="preserve">; its Amendment 1, adding thermal-propagation requirements with two compliance options — a physical propagation test or a documented risk-management approach — was proposed by the UNECE informal working group on electric vehicle safety as document EVS-30-C01/Rev.4 in September 2025 </w:t>
+      </w:r>
+      <w:r>
+        <w:rPr>
+          <w:rFonts w:ascii="Times New Roman" w:hAnsi="Times New Roman"/>
+          <w:sz w:val="20"/>
+        </w:rPr>
+        <w:t>[123]</w:t>
+      </w:r>
+      <w:r>
+        <w:rPr>
+          <w:rFonts w:ascii="Times New Roman" w:hAnsi="Times New Roman"/>
+          <w:b w:val="0"/>
+          <w:i w:val="0"/>
+          <w:sz w:val="20"/>
+        </w:rPr>
+        <w:t xml:space="preserve"> and stood, at this review’s September 2026 retrieval date, pending before WP.29 with adoption listed for its 17–20 November 2026 session), GB 38031 (GB 38031-2020, superseded for new type approvals by GB 38031-2025 from July 2026, with existing models transitioning through July 2027; GB 38031-2025 replaces the fire/explosion-warning criterion with no-fire/no-explosion thermal-diffusion requirements and adds bottom-impact and 300-cycle fast-charge safety tests </w:t>
+      </w:r>
+      <w:r>
+        <w:rPr>
+          <w:rFonts w:ascii="Times New Roman" w:hAnsi="Times New Roman"/>
+          <w:sz w:val="20"/>
+        </w:rPr>
+        <w:t>[29]</w:t>
+      </w:r>
+      <w:r>
+        <w:rPr>
+          <w:rFonts w:ascii="Times New Roman" w:hAnsi="Times New Roman"/>
+          <w:b w:val="0"/>
+          <w:i w:val="0"/>
+          <w:sz w:val="20"/>
+        </w:rPr>
+        <w:t xml:space="preserve">), ISO 26262:2018 (functional safety of road-vehicle E/E systems </w:t>
+      </w:r>
+      <w:r>
+        <w:rPr>
+          <w:rFonts w:ascii="Times New Roman" w:hAnsi="Times New Roman"/>
+          <w:sz w:val="20"/>
+        </w:rPr>
+        <w:t>[30]</w:t>
+      </w:r>
+      <w:r>
+        <w:rPr>
+          <w:rFonts w:ascii="Times New Roman" w:hAnsi="Times New Roman"/>
+          <w:b w:val="0"/>
+          <w:i w:val="0"/>
+          <w:sz w:val="20"/>
+        </w:rPr>
+        <w:t xml:space="preserve">), ISO/PAS 8800:2024 (safety and artificial intelligence — the road-vehicle extension of ISO 26262 and ISO 21448 to learned components </w:t>
+      </w:r>
+      <w:r>
+        <w:rPr>
+          <w:rFonts w:ascii="Times New Roman" w:hAnsi="Times New Roman"/>
+          <w:sz w:val="20"/>
+        </w:rPr>
+        <w:t>[124]</w:t>
+      </w:r>
+      <w:r>
+        <w:rPr>
+          <w:rFonts w:ascii="Times New Roman" w:hAnsi="Times New Roman"/>
+          <w:b w:val="0"/>
+          <w:i w:val="0"/>
+          <w:sz w:val="20"/>
+        </w:rPr>
+        <w:t xml:space="preserve">), and ISO 21448 (SOTIF </w:t>
+      </w:r>
+      <w:r>
+        <w:rPr>
+          <w:rFonts w:ascii="Times New Roman" w:hAnsi="Times New Roman"/>
+          <w:sz w:val="20"/>
+        </w:rPr>
+        <w:t>[125]</w:t>
+      </w:r>
+      <w:r>
+        <w:rPr>
+          <w:rFonts w:ascii="Times New Roman" w:hAnsi="Times New Roman"/>
+          <w:b w:val="0"/>
+          <w:i w:val="0"/>
+          <w:sz w:val="20"/>
+        </w:rPr>
+        <w:t xml:space="preserve">) — do not prescribe estimation algorithms, but they define what a deployed estimator or controller must be able to evidence, and Table 10 translates the subset’s gaps into those terms. The mapping is this review’s synthesis at requirement level rather than clause level, and it is stated so that it can be checked against the standards texts themselves: the point is not legal advice but that a validation protocol reported in a paper corresponds, or does not, to evidence a safety case can use. The inference rule behind every ‘supports a standards argument’ statement in this section is explicit: a paper’s evidence can support such an argument only if it demonstrates performance on at least one held-out integration unit (a cross-cell holdout or stronger isolation protocol, Section 2.5) and reports the environment in which that evidence was obtained; by construction, within-cell and k-fold evidence cannot support the argument, because the safety case is about unseen cells and unseen duty. Three consequences stand out for automotive deployment. Within-cell and k-fold validation (17 primary papers) cannot support an ISO 26262 argument, because the safety case is about unseen cells and unseen duty and the protocol never tests an unseen unit; a standards argument must therefore be </w:t>
       </w:r>
       <w:r>
         <w:rPr>
@@ -14150,7 +14310,7 @@
           <w:i w:val="0"/>
           <w:sz w:val="18"/>
         </w:rPr>
-        <w:t>Table 10 Mapping BMS functions to requirements in UN GTR 20 (Amendment 1 thermal-propagation provisions), GB 38031-2020/2025, ISO 26262:2018 with ISO/PAS 8800:2024, and ISO 21448 (SOTIF): what deployed ML components must be able to evidence. The mapping is this review’s synthesis at requirement level (not clause-level legal citation); the right-hand column gives the corresponding classified-subset primary-paper counts from Section 3.4.</w:t>
+        <w:t>Table 10 Mapping BMS functions to requirements in UN GTR 20 (Amendment 1 thermal-propagation provisions, EVS-30-C01/Rev.4), GB 38031-2020/2025, ISO 26262:2018 with ISO/PAS 8800:2024, and ISO 21448 (SOTIF): what deployed ML components must be able to evidence. The mapping is this review’s synthesis at requirement level (not clause-level legal citation); the right-hand column gives the corresponding classified-subset primary-paper counts from Section 3.4.</w:t>
       </w:r>
     </w:p>
     <w:tbl>
@@ -14267,7 +14427,28 @@
                 <w:i w:val="0"/>
                 <w:sz w:val="17"/>
               </w:rPr>
-              <w:t>ISO 26262:2018 treats estimation error that can enable overcharge/overdischarge as an E/E-system safety hazard to be handled through the safety lifecycle; ISO/PAS 8800:2024 extends this to learned elements (assurance argument over data, model, and known insufficiencies); UN GTR 20 / GB 38031-2025 treat overcharge as an abuse-protection requirement</w:t>
+              <w:t xml:space="preserve">ISO 26262:2018 treats estimation error that can enable overcharge/overdischarge as an E/E-system safety hazard to be handled through the safety lifecycle; ISO/PAS 8800:2024 extends this to learned elements (assurance argument over data, model, and known insufficiencies); UN GTR 20 / GB 38031-2025 treat overcharge as an abuse-protection requirement </w:t>
+            </w:r>
+            <w:r>
+              <w:rPr>
+                <w:rFonts w:ascii="Times New Roman" w:hAnsi="Times New Roman"/>
+                <w:sz w:val="17"/>
+              </w:rPr>
+              <w:t>[28]</w:t>
+            </w:r>
+            <w:r>
+              <w:rPr>
+                <w:rFonts w:ascii="Times New Roman" w:hAnsi="Times New Roman"/>
+                <w:sz w:val="17"/>
+              </w:rPr>
+              <w:t>[29]</w:t>
+            </w:r>
+            <w:r>
+              <w:rPr>
+                <w:rFonts w:ascii="Times New Roman" w:hAnsi="Times New Roman"/>
+                <w:sz w:val="17"/>
+              </w:rPr>
+              <w:t>[30]</w:t>
             </w:r>
           </w:p>
         </w:tc>
@@ -14326,7 +14507,23 @@
                 <w:i w:val="0"/>
                 <w:sz w:val="17"/>
               </w:rPr>
-              <w:t>Capacity and power fade margins underpin thermal-propagation early warning and end-of-service decisions; degradation assumptions must hold across chemistry, duty, and environment (ISO 26262 hazard analysis; ISO 21448 for performance limitations)</w:t>
+              <w:t xml:space="preserve">Capacity and power fade margins underpin thermal-propagation early warning and end-of-service decisions; degradation assumptions must hold across chemistry, duty, and environment (ISO 26262 hazard analysis; ISO 21448 for performance limitations </w:t>
+            </w:r>
+            <w:r>
+              <w:rPr>
+                <w:rFonts w:ascii="Times New Roman" w:hAnsi="Times New Roman"/>
+                <w:sz w:val="17"/>
+              </w:rPr>
+              <w:t>[125]</w:t>
+            </w:r>
+            <w:r>
+              <w:rPr>
+                <w:rFonts w:ascii="Times New Roman" w:hAnsi="Times New Roman"/>
+                <w:b w:val="0"/>
+                <w:i w:val="0"/>
+                <w:sz w:val="17"/>
+              </w:rPr>
+              <w:t>)</w:t>
             </w:r>
           </w:p>
         </w:tc>
@@ -14385,7 +14582,39 @@
                 <w:i w:val="0"/>
                 <w:sz w:val="17"/>
               </w:rPr>
-              <w:t>Thermal-propagation early warning must provide the escape window: GB 38031-2025 requires the warning signal but no fire/explosion beyond the triggered cell (superseding the GB 38031-2020 5-min criterion); the GTR 20 amendment proposes a ≥5-min advance warning before cabin hazards, via test or risk-management compliance path; coverage must be argued and audited (ISO/PAS 8800 assurance argument)</w:t>
+              <w:t xml:space="preserve">Thermal-propagation early warning must provide the escape window: GB 38031-2025 requires the warning signal but no fire/explosion beyond the triggered cell (superseding the GB 38031-2020 5-min criterion); the GTR 20 Amendment 1 proposal (EVS-30-C01/Rev.4) carries a ≥5-min advance-warning requirement before cabin hazards, with test or risk-management compliance options </w:t>
+            </w:r>
+            <w:r>
+              <w:rPr>
+                <w:rFonts w:ascii="Times New Roman" w:hAnsi="Times New Roman"/>
+                <w:sz w:val="17"/>
+              </w:rPr>
+              <w:t>[123]</w:t>
+            </w:r>
+            <w:r>
+              <w:rPr>
+                <w:rFonts w:ascii="Times New Roman" w:hAnsi="Times New Roman"/>
+                <w:b w:val="0"/>
+                <w:i w:val="0"/>
+                <w:sz w:val="17"/>
+              </w:rPr>
+              <w:t xml:space="preserve">; coverage must be argued and audited (ISO/PAS 8800 assurance argument </w:t>
+            </w:r>
+            <w:r>
+              <w:rPr>
+                <w:rFonts w:ascii="Times New Roman" w:hAnsi="Times New Roman"/>
+                <w:sz w:val="17"/>
+              </w:rPr>
+              <w:t>[124]</w:t>
+            </w:r>
+            <w:r>
+              <w:rPr>
+                <w:rFonts w:ascii="Times New Roman" w:hAnsi="Times New Roman"/>
+                <w:b w:val="0"/>
+                <w:i w:val="0"/>
+                <w:sz w:val="17"/>
+              </w:rPr>
+              <w:t>)</w:t>
             </w:r>
           </w:p>
         </w:tc>
@@ -14560,7 +14789,7 @@
           <w:i w:val="0"/>
           <w:sz w:val="20"/>
         </w:rPr>
-        <w:t xml:space="preserve">The corpus's first LLM-based management studies (2025-2026, and with LLM-based estimation prior art outside the screened venues) </w:t>
+        <w:t xml:space="preserve">The corpus's first LLM-based management studies (2025–2026, with LLM-based estimation prior art that this review’s retrieval missed — Section 8.4) </w:t>
       </w:r>
       <w:r>
         <w:rPr>
@@ -14630,7 +14859,7 @@
           <w:rFonts w:ascii="Times New Roman" w:hAnsi="Times New Roman"/>
           <w:sz w:val="20"/>
         </w:rPr>
-        <w:t>[28]</w:t>
+        <w:t>[31]</w:t>
       </w:r>
       <w:r>
         <w:rPr>
@@ -15174,7 +15403,7 @@
           <w:i w:val="0"/>
           <w:sz w:val="20"/>
         </w:rPr>
-        <w:t xml:space="preserve"> (240 studies across the EV powertrain, aggregating reported RMSE and R²); adjacent cross-functional surveys exist for degradation and estimation methods. This review is distinguished by what those studies do not attempt, and Table 12 states the comparison axis by axis: a two-tier corpus with record-level screening provenance (799 eligible records released in full, 103 classified in depth); a within-corpus measurement of validation-protocol strength across functions, with per-paper assignments released and method-family contrasts tested rather than asserted; a requirement-level mapping onto UN GTR 20, GB 38031, and ISO 26262; and a released, re-runnable analysis pipeline behind every count and figure. Where prior reviews ask </w:t>
+        <w:t xml:space="preserve"> (240 studies, included from 361 screened records, across the EV powertrain, aggregating reported RMSE and R²); adjacent cross-functional surveys exist for degradation and estimation methods. This review is distinguished by what those studies do not attempt, and Table 12 states the comparison axis by axis: a two-tier corpus with record-level screening provenance (799 eligible records released in full, 103 classified in depth); a within-corpus measurement of validation-protocol strength across functions, with per-paper assignments released and method-family contrasts tested rather than asserted; a requirement-level mapping onto UN GTR 20, GB 38031, and ISO 26262; and a released, re-runnable analysis pipeline behind every count and figure. Where prior reviews ask </w:t>
       </w:r>
       <w:r>
         <w:rPr>
@@ -15226,7 +15455,7 @@
           <w:i w:val="0"/>
           <w:sz w:val="18"/>
         </w:rPr>
-        <w:t>Table 12 Position relative to prior reviews. “Prasanna 2026” denotes the 2026 performance-centric ML review of EV powertrains with BMS and charging scope (240 studies, aggregated reported RMSE/R²). The function-specific and method-specific reviews named in Section 1.3 cover single functions or methods, so none of them addresses the axes below; the comparison is per axis, not per review. This review differs most in the validation measurement (within a curated subset), standards linkage, and released record-level artifacts.</w:t>
+        <w:t>Table 12 Position relative to prior reviews. “Prasanna 2026” denotes the 2026 performance-centric ML review of EV powertrains with BMS and charging scope (240 studies, included from 361 screened records; aggregated reported RMSE/R²). The function-specific and method-specific reviews named in Section 1.3 cover single functions or methods, so none of them, to our knowledge, addresses the axes below; the comparison is per axis, not per review. This review differs most in the validation measurement (within a curated subset), standards linkage, and released record-level artifacts.</w:t>
       </w:r>
     </w:p>
     <w:tbl>
@@ -15360,7 +15589,7 @@
                 <w:i w:val="0"/>
                 <w:sz w:val="17"/>
               </w:rPr>
-              <w:t>Fixed study lists without record-level selection provenance</w:t>
+              <w:t>Fixed study lists; no record-level selection provenance in the works we examined</w:t>
             </w:r>
           </w:p>
         </w:tc>
@@ -15419,7 +15648,7 @@
                 <w:i w:val="0"/>
                 <w:sz w:val="17"/>
               </w:rPr>
-              <w:t>Narrative remarks on data scarcity; protocol strength not quantified</w:t>
+              <w:t>Narrative remarks on data scarcity; protocol strength not quantified, to our knowledge</w:t>
             </w:r>
           </w:p>
         </w:tc>
@@ -15596,7 +15825,7 @@
                 <w:i w:val="0"/>
                 <w:sz w:val="17"/>
               </w:rPr>
-              <w:t>No released record-level dataset</w:t>
+              <w:t>No released record-level dataset that we could locate</w:t>
             </w:r>
           </w:p>
         </w:tc>
@@ -15679,7 +15908,7 @@
           <w:rFonts w:ascii="Times New Roman" w:hAnsi="Times New Roman"/>
           <w:sz w:val="20"/>
         </w:rPr>
-        <w:t>[61]</w:t>
+        <w:t>[64]</w:t>
       </w:r>
       <w:r>
         <w:rPr>
@@ -16711,7 +16940,7 @@
           <w:rFonts w:ascii="Times New Roman" w:hAnsi="Times New Roman"/>
           <w:sz w:val="18"/>
         </w:rPr>
-        <w:t>[61]</w:t>
+        <w:t>[64]</w:t>
       </w:r>
       <w:r>
         <w:rPr>
@@ -16743,7 +16972,7 @@
           <w:rFonts w:ascii="Times New Roman" w:hAnsi="Times New Roman"/>
           <w:sz w:val="18"/>
         </w:rPr>
-        <w:t>[12, 114]</w:t>
+        <w:t>[12, 117]</w:t>
       </w:r>
       <w:r>
         <w:rPr>
@@ -16759,7 +16988,7 @@
           <w:rFonts w:ascii="Times New Roman" w:hAnsi="Times New Roman"/>
           <w:sz w:val="18"/>
         </w:rPr>
-        <w:t>[84, 94]</w:t>
+        <w:t>[87, 97]</w:t>
       </w:r>
       <w:r>
         <w:rPr>
@@ -17632,7 +17861,7 @@
           <w:rFonts w:ascii="Times New Roman" w:hAnsi="Times New Roman"/>
           <w:sz w:val="18"/>
         </w:rPr>
-        <w:t>Hardy, J., Steggall, J., Hardy, P., “Rethinking lithium-ion battery management: Eliminating routine cell balancing enhances hazardous fault detection,” Journal of Energy Storage, vol. 63, 106931, 2023, doi: 10.1016/j.est.2023.106931.</w:t>
+        <w:t>United Nations Economic Commission for Europe, “Global technical regulation No. 20: Electric vehicle safety (EVS),” UN Global Registry, ECE/TRANS/180/Add.20, 2018. Established in the Global Registry on 13 June 2018. [Online]. Available: https://unece.org/transport/standards/transport/vehicle-regulations-wp29/global-technical-regulations-gtrs</w:t>
       </w:r>
     </w:p>
     <w:p>
@@ -17653,7 +17882,7 @@
           <w:rFonts w:ascii="Times New Roman" w:hAnsi="Times New Roman"/>
           <w:sz w:val="18"/>
         </w:rPr>
-        <w:t>Vidal, C., Kollmeyer, P., Chemali, E., Emadi, A., “Li-ion Battery State of Charge Estimation Using Long Short-Term Memory Recurrent Neural Network with Transfer Learning,” 2019 IEEE Transportation Electrification Conference and Expo (ITEC), 1-6, 2019, doi: 10.1109/itec.2019.8790543.</w:t>
+        <w:t>State Administration for Market Regulation, Standardization Administration of China, “Safety requirements for power batteries for electric vehicles,” GB 38031-2025, 2025. Published 28 March 2025; effective 1 July 2026 for new type approvals and 1 July 2027 for existing models; supersedes GB 38031-2020.</w:t>
       </w:r>
     </w:p>
     <w:p>
@@ -17674,7 +17903,7 @@
           <w:rFonts w:ascii="Times New Roman" w:hAnsi="Times New Roman"/>
           <w:sz w:val="18"/>
         </w:rPr>
-        <w:t>Gruosso, G., Gajani, G. S., Valladolid, J. D., Patino, D., Ruiz, F., “State of Charge Estimation of LiFePO4 Battery Used in Electric Vehicles Using Support Vector Regression, PCA and DP Battery Model,” 2019 IEEE Vehicle Power and Propulsion Conference (VPPC), 1-5, 2019, doi: 10.1109/vppc46532.2019.8952458.</w:t>
+        <w:t>International Organization for Standardization, “Road vehicles — Functional safety,” ISO 26262:2018, 2018.</w:t>
       </w:r>
     </w:p>
     <w:p>
@@ -17695,7 +17924,7 @@
           <w:rFonts w:ascii="Times New Roman" w:hAnsi="Times New Roman"/>
           <w:sz w:val="18"/>
         </w:rPr>
-        <w:t>Fan, C., Higgins, M. D., Widanage, W. D., “Real-Time State of Charge Estimation of Electrochemical Model for Lithium-Ion Battery,” 2019 IEEE Vehicle Power and Propulsion Conference (VPPC), 1-6, 2019, doi: 10.1109/vppc46532.2019.8952284.</w:t>
+        <w:t>Hardy, J., Steggall, J., Hardy, P., “Rethinking lithium-ion battery management: Eliminating routine cell balancing enhances hazardous fault detection,” Journal of Energy Storage, vol. 63, 106931, 2023, doi: 10.1016/j.est.2023.106931.</w:t>
       </w:r>
     </w:p>
     <w:p>
@@ -17716,7 +17945,7 @@
           <w:rFonts w:ascii="Times New Roman" w:hAnsi="Times New Roman"/>
           <w:sz w:val="18"/>
         </w:rPr>
-        <w:t>Su, J., Schneider, S., Yaz, E., Josse, F., “Online State of Charge Estimation of Lithium-ion Battery Cells: A Multiple Model Adaptive Estimation Approach,” 2021 American Control Conference (ACC), 4447-4452, 2021, doi: 10.23919/acc50511.2021.9482734.</w:t>
+        <w:t>Vidal, C., Kollmeyer, P., Chemali, E., Emadi, A., “Li-ion Battery State of Charge Estimation Using Long Short-Term Memory Recurrent Neural Network with Transfer Learning,” 2019 IEEE Transportation Electrification Conference and Expo (ITEC), 1-6, 2019, doi: 10.1109/itec.2019.8790543.</w:t>
       </w:r>
     </w:p>
     <w:p>
@@ -17737,7 +17966,7 @@
           <w:rFonts w:ascii="Times New Roman" w:hAnsi="Times New Roman"/>
           <w:sz w:val="18"/>
         </w:rPr>
-        <w:t>Monteiro, P., Araujo, R. E., Pinto, C., Matz, S., “Li-ion battery State-of-Charge estimation using computationally efficient neural network models,” 2021 IEEE Vehicle Power and Propulsion Conference (VPPC), 1-6, 2021, doi: 10.1109/vppc53923.2021.9699201.</w:t>
+        <w:t>Gruosso, G., Gajani, G. S., Valladolid, J. D., Patino, D., Ruiz, F., “State of Charge Estimation of LiFePO4 Battery Used in Electric Vehicles Using Support Vector Regression, PCA and DP Battery Model,” 2019 IEEE Vehicle Power and Propulsion Conference (VPPC), 1-5, 2019, doi: 10.1109/vppc46532.2019.8952458.</w:t>
       </w:r>
     </w:p>
     <w:p>
@@ -17758,7 +17987,7 @@
           <w:rFonts w:ascii="Times New Roman" w:hAnsi="Times New Roman"/>
           <w:sz w:val="18"/>
         </w:rPr>
-        <w:t>Bandara, T. T. A., Anton, J. A., Gonzalez, M., Anseana, D., Viera, J., “State of Health Estimation using Machine Learning for Li-ion battery on Electric Vehicles,” 2021 IEEE Vehicle Power and Propulsion Conference (VPPC), 1-4, 2021, doi: 10.1109/vppc53923.2021.9699273.</w:t>
+        <w:t>Fan, C., Higgins, M. D., Widanage, W. D., “Real-Time State of Charge Estimation of Electrochemical Model for Lithium-Ion Battery,” 2019 IEEE Vehicle Power and Propulsion Conference (VPPC), 1-6, 2019, doi: 10.1109/vppc46532.2019.8952284.</w:t>
       </w:r>
     </w:p>
     <w:p>
@@ -17779,7 +18008,7 @@
           <w:rFonts w:ascii="Times New Roman" w:hAnsi="Times New Roman"/>
           <w:sz w:val="18"/>
         </w:rPr>
-        <w:t>Natella, D., Vasca, F., “Battery State of Health Estimation via Reinforcement Learning,” 2021 European Control Conference (ECC), 1657-1662, 2021, doi: 10.23919/ecc54610.2021.9655199.</w:t>
+        <w:t>Su, J., Schneider, S., Yaz, E., Josse, F., “Online State of Charge Estimation of Lithium-ion Battery Cells: A Multiple Model Adaptive Estimation Approach,” 2021 American Control Conference (ACC), 4447-4452, 2021, doi: 10.23919/acc50511.2021.9482734.</w:t>
       </w:r>
     </w:p>
     <w:p>
@@ -17800,7 +18029,7 @@
           <w:rFonts w:ascii="Times New Roman" w:hAnsi="Times New Roman"/>
           <w:sz w:val="18"/>
         </w:rPr>
-        <w:t>Li, P., Cheng, Y., Shan, K., Fang, Y., “State-of-health estimation of lithium-ion battery based on feature transfer learning,” 2022 34th Chinese Control and Decision Conference (CCDC), 889-894, 2022, doi: 10.1109/ccdc55256.2022.10033695.</w:t>
+        <w:t>Monteiro, P., Araujo, R. E., Pinto, C., Matz, S., “Li-ion battery State-of-Charge estimation using computationally efficient neural network models,” 2021 IEEE Vehicle Power and Propulsion Conference (VPPC), 1-6, 2021, doi: 10.1109/vppc53923.2021.9699201.</w:t>
       </w:r>
     </w:p>
     <w:p>
@@ -17821,7 +18050,7 @@
           <w:rFonts w:ascii="Times New Roman" w:hAnsi="Times New Roman"/>
           <w:sz w:val="18"/>
         </w:rPr>
-        <w:t>Benlamine, K., Mesbahi, T., “Machine Learning Applied to Battery Prognostics based on Advanced State of Health Estimation,” 2022 IEEE Vehicle Power and Propulsion Conference (VPPC), 1-6, 2022, doi: 10.1109/vppc55846.2022.10003444.</w:t>
+        <w:t>Bandara, T. T. A., Anton, J. A., Gonzalez, M., Anseana, D., Viera, J., “State of Health Estimation using Machine Learning for Li-ion battery on Electric Vehicles,” 2021 IEEE Vehicle Power and Propulsion Conference (VPPC), 1-4, 2021, doi: 10.1109/vppc53923.2021.9699273.</w:t>
       </w:r>
     </w:p>
     <w:p>
@@ -17842,7 +18071,7 @@
           <w:rFonts w:ascii="Times New Roman" w:hAnsi="Times New Roman"/>
           <w:sz w:val="18"/>
         </w:rPr>
-        <w:t>Duque, J., Kollmeyer, P. J., Naguib, M., Emadi, A., “Battery Dual Extended Kalman Filter State of Charge and Health Estimation Strategy for Traction Applications,” 2022 IEEE Transportation Electrification Conference &amp; Expo (ITEC), 975-980, 2022, doi: 10.1109/itec53557.2022.9813961.</w:t>
+        <w:t>Natella, D., Vasca, F., “Battery State of Health Estimation via Reinforcement Learning,” 2021 European Control Conference (ECC), 1657-1662, 2021, doi: 10.23919/ecc54610.2021.9655199.</w:t>
       </w:r>
     </w:p>
     <w:p>
@@ -17863,7 +18092,7 @@
           <w:rFonts w:ascii="Times New Roman" w:hAnsi="Times New Roman"/>
           <w:sz w:val="18"/>
         </w:rPr>
-        <w:t>Bhaskar, K., Kumar, A., Bunce, J., Pressman, J., Burkell, N., Miller, N., et al., “State of Charge and State of Health estimation in large lithium-ion battery packs,” 2023 American Control Conference (ACC), 3075-3080, 2023, doi: 10.23919/acc55779.2023.10156326.</w:t>
+        <w:t>Li, P., Cheng, Y., Shan, K., Fang, Y., “State-of-health estimation of lithium-ion battery based on feature transfer learning,” 2022 34th Chinese Control and Decision Conference (CCDC), 889-894, 2022, doi: 10.1109/ccdc55256.2022.10033695.</w:t>
       </w:r>
     </w:p>
     <w:p>
@@ -17884,7 +18113,7 @@
           <w:rFonts w:ascii="Times New Roman" w:hAnsi="Times New Roman"/>
           <w:sz w:val="18"/>
         </w:rPr>
-        <w:t>Zhuge, Y., Yang, H., Wang, H., “Overview of Machine Learning-Enabled Battery State Estimation Methods,” 2023 IEEE Applied Power Electronics Conference and Exposition (APEC), 3028-3035, 2023, doi: 10.1109/apec43580.2023.10131605.</w:t>
+        <w:t>Benlamine, K., Mesbahi, T., “Machine Learning Applied to Battery Prognostics based on Advanced State of Health Estimation,” 2022 IEEE Vehicle Power and Propulsion Conference (VPPC), 1-6, 2022, doi: 10.1109/vppc55846.2022.10003444.</w:t>
       </w:r>
     </w:p>
     <w:p>
@@ -17905,7 +18134,7 @@
           <w:rFonts w:ascii="Times New Roman" w:hAnsi="Times New Roman"/>
           <w:sz w:val="18"/>
         </w:rPr>
-        <w:t>Chen, J., Kollmeyer, P., Chiang, F., Emadi, A., “Lithium-ion Battery State-of-Health Estimation via Histogram Data, Principal Component Analysis, and Machine Learning,” 2023 IEEE Transportation Electrification Conference &amp; Expo (ITEC), 1-6, 2023, doi: 10.1109/itec55900.2023.10187012.</w:t>
+        <w:t>Duque, J., Kollmeyer, P. J., Naguib, M., Emadi, A., “Battery Dual Extended Kalman Filter State of Charge and Health Estimation Strategy for Traction Applications,” 2022 IEEE Transportation Electrification Conference &amp; Expo (ITEC), 975-980, 2022, doi: 10.1109/itec53557.2022.9813961.</w:t>
       </w:r>
     </w:p>
     <w:p>
@@ -17926,7 +18155,7 @@
           <w:rFonts w:ascii="Times New Roman" w:hAnsi="Times New Roman"/>
           <w:sz w:val="18"/>
         </w:rPr>
-        <w:t>Jiang, S., Shi, J., Borah, M., Moura, S., “Weaknesses and Improvements of the Extended Kalman Filter for Battery State-of-Charge and State-of-Health Estimation,” 2024 American Control Conference (ACC), 1441-1448, 2024, doi: 10.23919/acc60939.2024.10644628.</w:t>
+        <w:t>Bhaskar, K., Kumar, A., Bunce, J., Pressman, J., Burkell, N., Miller, N., et al., “State of Charge and State of Health estimation in large lithium-ion battery packs,” 2023 American Control Conference (ACC), 3075-3080, 2023, doi: 10.23919/acc55779.2023.10156326.</w:t>
       </w:r>
     </w:p>
     <w:p>
@@ -17947,7 +18176,7 @@
           <w:rFonts w:ascii="Times New Roman" w:hAnsi="Times New Roman"/>
           <w:sz w:val="18"/>
         </w:rPr>
-        <w:t>Deng, Z., Hu, X., Lin, X., Che, Y., Xu, L., Guo, W., “Data-driven state of charge estimation for lithium-ion battery packs based on Gaussian process regression,” Energy, vol. 205, 118000, 2020, doi: 10.1016/j.energy.2020.118000.</w:t>
+        <w:t>Zhuge, Y., Yang, H., Wang, H., “Overview of Machine Learning-Enabled Battery State Estimation Methods,” 2023 IEEE Applied Power Electronics Conference and Exposition (APEC), 3028-3035, 2023, doi: 10.1109/apec43580.2023.10131605.</w:t>
       </w:r>
     </w:p>
     <w:p>
@@ -17968,7 +18197,7 @@
           <w:rFonts w:ascii="Times New Roman" w:hAnsi="Times New Roman"/>
           <w:sz w:val="18"/>
         </w:rPr>
-        <w:t>Chandran, V., Patil, C. K., Karthick, A., Ganeshaperumal, D., Rahim, R., Ghosh, A., “State of Charge Estimation of Lithium-Ion Battery for Electric Vehicles Using Machine Learning Algorithms,” World Electric Vehicle Journal, vol. 12, 38, 2021, doi: 10.3390/wevj12010038.</w:t>
+        <w:t>Chen, J., Kollmeyer, P., Chiang, F., Emadi, A., “Lithium-ion Battery State-of-Health Estimation via Histogram Data, Principal Component Analysis, and Machine Learning,” 2023 IEEE Transportation Electrification Conference &amp; Expo (ITEC), 1-6, 2023, doi: 10.1109/itec55900.2023.10187012.</w:t>
       </w:r>
     </w:p>
     <w:p>
@@ -17989,7 +18218,7 @@
           <w:rFonts w:ascii="Times New Roman" w:hAnsi="Times New Roman"/>
           <w:sz w:val="18"/>
         </w:rPr>
-        <w:t>Ragone, M., Yurkiv, V., Ramasubramanian, A., Kashir, B., Mashayek, F., “Data driven estimation of electric vehicle battery state-of-charge informed by automotive simulations and multi-physics modeling,” Journal of Power Sources, vol. 483, 229108, 2021, doi: 10.1016/j.jpowsour.2020.229108.</w:t>
+        <w:t>Jiang, S., Shi, J., Borah, M., Moura, S., “Weaknesses and Improvements of the Extended Kalman Filter for Battery State-of-Charge and State-of-Health Estimation,” 2024 American Control Conference (ACC), 1441-1448, 2024, doi: 10.23919/acc60939.2024.10644628.</w:t>
       </w:r>
     </w:p>
     <w:p>
@@ -18010,7 +18239,7 @@
           <w:rFonts w:ascii="Times New Roman" w:hAnsi="Times New Roman"/>
           <w:sz w:val="18"/>
         </w:rPr>
-        <w:t>Ren, X., Liu, S., Yu, X., Dong, X., “A method for state-of-charge estimation of lithium-ion batteries based on PSO-LSTM,” Energy, vol. 234, 121236, 2021, doi: 10.1016/j.energy.2021.121236.</w:t>
+        <w:t>Deng, Z., Hu, X., Lin, X., Che, Y., Xu, L., Guo, W., “Data-driven state of charge estimation for lithium-ion battery packs based on Gaussian process regression,” Energy, vol. 205, 118000, 2020, doi: 10.1016/j.energy.2020.118000.</w:t>
       </w:r>
     </w:p>
     <w:p>
@@ -18031,7 +18260,7 @@
           <w:rFonts w:ascii="Times New Roman" w:hAnsi="Times New Roman"/>
           <w:sz w:val="18"/>
         </w:rPr>
-        <w:t>Khan, M. K., Houran, M. A., Kauhaniemi, K., Zafar, M. H., Mansoor, M., Rashid, S., “Efficient state of charge estimation of lithium-ion batteries in electric vehicles using evolutionary intelligence-assisted GLA–CNN–Bi-LSTM deep learning model,” Heliyon, vol. 10, e35183, 2024, doi: 10.1016/j.heliyon.2024.e35183.</w:t>
+        <w:t>Chandran, V., Patil, C. K., Karthick, A., Ganeshaperumal, D., Rahim, R., Ghosh, A., “State of Charge Estimation of Lithium-Ion Battery for Electric Vehicles Using Machine Learning Algorithms,” World Electric Vehicle Journal, vol. 12, 38, 2021, doi: 10.3390/wevj12010038.</w:t>
       </w:r>
     </w:p>
     <w:p>
@@ -18052,7 +18281,7 @@
           <w:rFonts w:ascii="Times New Roman" w:hAnsi="Times New Roman"/>
           <w:sz w:val="18"/>
         </w:rPr>
-        <w:t>Naguib, M., Kollmeyer, P., Emadi, A., “Lithium-Ion Battery Pack Robust State of Charge Estimation, Cell Inconsistency, and Balancing: Review,” IEEE Access, vol. 9, 50570-50582, 2021, doi: 10.1109/access.2021.3068776.</w:t>
+        <w:t>Ragone, M., Yurkiv, V., Ramasubramanian, A., Kashir, B., Mashayek, F., “Data driven estimation of electric vehicle battery state-of-charge informed by automotive simulations and multi-physics modeling,” Journal of Power Sources, vol. 483, 229108, 2021, doi: 10.1016/j.jpowsour.2020.229108.</w:t>
       </w:r>
     </w:p>
     <w:p>
@@ -18073,7 +18302,7 @@
           <w:rFonts w:ascii="Times New Roman" w:hAnsi="Times New Roman"/>
           <w:sz w:val="18"/>
         </w:rPr>
-        <w:t>Zou, M., Wang, J., Yan, D., Li, Y., Tang, X., “Novel state of charge estimation method of containerized Lithium–Ion battery energy storage system based on deep learning,” Journal of Power Sources, vol. 624, 235609, 2024, doi: 10.1016/j.jpowsour.2024.235609.</w:t>
+        <w:t>Ren, X., Liu, S., Yu, X., Dong, X., “A method for state-of-charge estimation of lithium-ion batteries based on PSO-LSTM,” Energy, vol. 234, 121236, 2021, doi: 10.1016/j.energy.2021.121236.</w:t>
       </w:r>
     </w:p>
     <w:p>
@@ -18094,7 +18323,7 @@
           <w:rFonts w:ascii="Times New Roman" w:hAnsi="Times New Roman"/>
           <w:sz w:val="18"/>
         </w:rPr>
-        <w:t>Tian, J., Xiong, R., Shen, W., Lu, J., Sun, F., “Flexible battery state of health and state of charge estimation using partial charging data and deep learning,” Energy Storage Materials, vol. 51, 372-381, 2022, doi: 10.1016/j.ensm.2022.06.053.</w:t>
+        <w:t>Khan, M. K., Houran, M. A., Kauhaniemi, K., Zafar, M. H., Mansoor, M., Rashid, S., “Efficient state of charge estimation of lithium-ion batteries in electric vehicles using evolutionary intelligence-assisted GLA–CNN–Bi-LSTM deep learning model,” Heliyon, vol. 10, e35183, 2024, doi: 10.1016/j.heliyon.2024.e35183.</w:t>
       </w:r>
     </w:p>
     <w:p>
@@ -18115,7 +18344,7 @@
           <w:rFonts w:ascii="Times New Roman" w:hAnsi="Times New Roman"/>
           <w:sz w:val="18"/>
         </w:rPr>
-        <w:t>Arandhakar, S., Nakka, J., “State of charge estimation of lithium ion battery for electric vehicle using cutting edge machine learning algorithms: A review,” Journal of Energy Storage, vol. 103, 114281, 2024, doi: 10.1016/j.est.2024.114281.</w:t>
+        <w:t>Naguib, M., Kollmeyer, P., Emadi, A., “Lithium-Ion Battery Pack Robust State of Charge Estimation, Cell Inconsistency, and Balancing: Review,” IEEE Access, vol. 9, 50570-50582, 2021, doi: 10.1109/access.2021.3068776.</w:t>
       </w:r>
     </w:p>
     <w:p>
@@ -18136,7 +18365,7 @@
           <w:rFonts w:ascii="Times New Roman" w:hAnsi="Times New Roman"/>
           <w:sz w:val="18"/>
         </w:rPr>
-        <w:t>Khan, U., Kirmani, S., Rafat, Y., Rehman, M. U., Alam, M. S., “Improved deep learning based state of charge estimation of lithium ion battery for electrified transportation,” Journal of Energy Storage, vol. 91, 111877, 2024, doi: 10.1016/j.est.2024.111877.</w:t>
+        <w:t>Zou, M., Wang, J., Yan, D., Li, Y., Tang, X., “Novel state of charge estimation method of containerized Lithium–Ion battery energy storage system based on deep learning,” Journal of Power Sources, vol. 624, 235609, 2024, doi: 10.1016/j.jpowsour.2024.235609.</w:t>
       </w:r>
     </w:p>
     <w:p>
@@ -18157,7 +18386,7 @@
           <w:rFonts w:ascii="Times New Roman" w:hAnsi="Times New Roman"/>
           <w:sz w:val="18"/>
         </w:rPr>
-        <w:t>Wang, J., Zuo, Z., Wei, Y., Jia, Y., Chen, B., Li, Y., et al., “State of charge estimation of lithium-ion battery based on GA-LSTM and improved IAKF,” Applied Energy, vol. 368, 123508, 2024, doi: 10.1016/j.apenergy.2024.123508.</w:t>
+        <w:t>Tian, J., Xiong, R., Shen, W., Lu, J., Sun, F., “Flexible battery state of health and state of charge estimation using partial charging data and deep learning,” Energy Storage Materials, vol. 51, 372-381, 2022, doi: 10.1016/j.ensm.2022.06.053.</w:t>
       </w:r>
     </w:p>
     <w:p>
@@ -18178,7 +18407,7 @@
           <w:rFonts w:ascii="Times New Roman" w:hAnsi="Times New Roman"/>
           <w:sz w:val="18"/>
         </w:rPr>
-        <w:t>Buchicchio, E., De Angelis, A., Santoni, F., Carbone, P., Bianconi, F., Smeraldi, F., “Battery SOC estimation from EIS data based on machine learning and equivalent circuit model,” Energy, vol. 283, 128461, 2023, doi: 10.1016/j.energy.2023.128461.</w:t>
+        <w:t>Arandhakar, S., Nakka, J., “State of charge estimation of lithium ion battery for electric vehicle using cutting edge machine learning algorithms: A review,” Journal of Energy Storage, vol. 103, 114281, 2024, doi: 10.1016/j.est.2024.114281.</w:t>
       </w:r>
     </w:p>
     <w:p>
@@ -18199,7 +18428,7 @@
           <w:rFonts w:ascii="Times New Roman" w:hAnsi="Times New Roman"/>
           <w:sz w:val="18"/>
         </w:rPr>
-        <w:t>Galiounas, E., Tranter, T. G., Owen, R. E., Robinson, J. B., Shearing, P. R., Brett, D. J., “Battery state-of-charge estimation using machine learning analysis of ultrasonic signatures,” Energy and AI, vol. 10, 100188, 2022, doi: 10.1016/j.egyai.2022.100188.</w:t>
+        <w:t>Khan, U., Kirmani, S., Rafat, Y., Rehman, M. U., Alam, M. S., “Improved deep learning based state of charge estimation of lithium ion battery for electrified transportation,” Journal of Energy Storage, vol. 91, 111877, 2024, doi: 10.1016/j.est.2024.111877.</w:t>
       </w:r>
     </w:p>
     <w:p>
@@ -18220,7 +18449,7 @@
           <w:rFonts w:ascii="Times New Roman" w:hAnsi="Times New Roman"/>
           <w:sz w:val="18"/>
         </w:rPr>
-        <w:t>Li, X., Yuan, C., Li, X., Wang, Z., “State of health estimation for Li-Ion battery using incremental capacity analysis and Gaussian process regression,” Energy, vol. 190, 116467, 2020, doi: 10.1016/j.energy.2019.116467.</w:t>
+        <w:t>Wang, J., Zuo, Z., Wei, Y., Jia, Y., Chen, B., Li, Y., et al., “State of charge estimation of lithium-ion battery based on GA-LSTM and improved IAKF,” Applied Energy, vol. 368, 123508, 2024, doi: 10.1016/j.apenergy.2024.123508.</w:t>
       </w:r>
     </w:p>
     <w:p>
@@ -18241,7 +18470,7 @@
           <w:rFonts w:ascii="Times New Roman" w:hAnsi="Times New Roman"/>
           <w:sz w:val="18"/>
         </w:rPr>
-        <w:t>Wang, Z., Yuan, C., Li, X., “Lithium Battery State-of-Health Estimation via Differential Thermal Voltammetry With Gaussian Process Regression,” IEEE Transactions on Transportation Electrification, vol. 7, 16-25, 2021, doi: 10.1109/tte.2020.3028784.</w:t>
+        <w:t>Buchicchio, E., De Angelis, A., Santoni, F., Carbone, P., Bianconi, F., Smeraldi, F., “Battery SOC estimation from EIS data based on machine learning and equivalent circuit model,” Energy, vol. 283, 128461, 2023, doi: 10.1016/j.energy.2023.128461.</w:t>
       </w:r>
     </w:p>
     <w:p>
@@ -18262,7 +18491,7 @@
           <w:rFonts w:ascii="Times New Roman" w:hAnsi="Times New Roman"/>
           <w:sz w:val="18"/>
         </w:rPr>
-        <w:t>Tagade, P., Hariharan, K. S., Ramachandran, S., Khandelwal, A., Naha, A., Kolake, S. M., et al., “Deep Gaussian process regression for lithium-ion battery health prognosis and degradation mode diagnosis,” Journal of Power Sources, vol. 445, 227281, 2020, doi: 10.1016/j.jpowsour.2019.227281.</w:t>
+        <w:t>Galiounas, E., Tranter, T. G., Owen, R. E., Robinson, J. B., Shearing, P. R., Brett, D. J., “Battery state-of-charge estimation using machine learning analysis of ultrasonic signatures,” Energy and AI, vol. 10, 100188, 2022, doi: 10.1016/j.egyai.2022.100188.</w:t>
       </w:r>
     </w:p>
     <w:p>
@@ -18283,7 +18512,7 @@
           <w:rFonts w:ascii="Times New Roman" w:hAnsi="Times New Roman"/>
           <w:sz w:val="18"/>
         </w:rPr>
-        <w:t>Deng, Z., Hu, X., Li, P., Lin, X., Bian, X., “Data-Driven Battery State of Health Estimation Based on Random Partial Charging Data,” IEEE Transactions on Power Electronics, vol. 37, 5021-5031, 2022, doi: 10.1109/tpel.2021.3134701.</w:t>
+        <w:t>Li, X., Yuan, C., Li, X., Wang, Z., “State of health estimation for Li-Ion battery using incremental capacity analysis and Gaussian process regression,” Energy, vol. 190, 116467, 2020, doi: 10.1016/j.energy.2019.116467.</w:t>
       </w:r>
     </w:p>
     <w:p>
@@ -18304,7 +18533,7 @@
           <w:rFonts w:ascii="Times New Roman" w:hAnsi="Times New Roman"/>
           <w:sz w:val="18"/>
         </w:rPr>
-        <w:t>Zheng, K., Meng, J., Yang, Z., Zhou, F., Yang, K., Song, Z., “Refined lithium-ion battery state of health estimation with charging segment adjustment,” Applied Energy, vol. 375, 124077, 2024, doi: 10.1016/j.apenergy.2024.124077.</w:t>
+        <w:t>Wang, Z., Yuan, C., Li, X., “Lithium Battery State-of-Health Estimation via Differential Thermal Voltammetry With Gaussian Process Regression,” IEEE Transactions on Transportation Electrification, vol. 7, 16-25, 2021, doi: 10.1109/tte.2020.3028784.</w:t>
       </w:r>
     </w:p>
     <w:p>
@@ -18325,7 +18554,7 @@
           <w:rFonts w:ascii="Times New Roman" w:hAnsi="Times New Roman"/>
           <w:sz w:val="18"/>
         </w:rPr>
-        <w:t>Roman, D., Saxena, S., Robu, V., Pecht, M., Flynn, D., “Machine learning pipeline for battery state-of-health estimation,” Nature Machine Intelligence, vol. 3, 447-456, 2021, doi: 10.1038/s42256-021-00312-3.</w:t>
+        <w:t>Tagade, P., Hariharan, K. S., Ramachandran, S., Khandelwal, A., Naha, A., Kolake, S. M., et al., “Deep Gaussian process regression for lithium-ion battery health prognosis and degradation mode diagnosis,” Journal of Power Sources, vol. 445, 227281, 2020, doi: 10.1016/j.jpowsour.2019.227281.</w:t>
       </w:r>
     </w:p>
     <w:p>
@@ -18346,7 +18575,7 @@
           <w:rFonts w:ascii="Times New Roman" w:hAnsi="Times New Roman"/>
           <w:sz w:val="18"/>
         </w:rPr>
-        <w:t>Zhao, J., Qu, X., Li, Y., Nan, J., Burke, A. F., “Real-time prediction of battery remaining useful life using hybrid-fusion deep neural networks,” Energy, vol. 328, 136618, 2025, doi: 10.1016/j.energy.2025.136618.</w:t>
+        <w:t>Deng, Z., Hu, X., Li, P., Lin, X., Bian, X., “Data-Driven Battery State of Health Estimation Based on Random Partial Charging Data,” IEEE Transactions on Power Electronics, vol. 37, 5021-5031, 2022, doi: 10.1109/tpel.2021.3134701.</w:t>
       </w:r>
     </w:p>
     <w:p>
@@ -18367,7 +18596,7 @@
           <w:rFonts w:ascii="Times New Roman" w:hAnsi="Times New Roman"/>
           <w:sz w:val="18"/>
         </w:rPr>
-        <w:t>Zhou, K. Q., Qin, Y., Yuen, C., “Graph neural network-based lithium-ion battery state of health estimation using partial discharging curve,” Journal of Energy Storage, vol. 100, 113502, 2024, doi: 10.1016/j.est.2024.113502.</w:t>
+        <w:t>Zheng, K., Meng, J., Yang, Z., Zhou, F., Yang, K., Song, Z., “Refined lithium-ion battery state of health estimation with charging segment adjustment,” Applied Energy, vol. 375, 124077, 2024, doi: 10.1016/j.apenergy.2024.124077.</w:t>
       </w:r>
     </w:p>
     <w:p>
@@ -18388,7 +18617,7 @@
           <w:rFonts w:ascii="Times New Roman" w:hAnsi="Times New Roman"/>
           <w:sz w:val="18"/>
         </w:rPr>
-        <w:t>Zhao, B., Zhang, W., Zhang, Y., Zhang, C., Zhang, C., Zhang, J., “Lithium-ion battery remaining useful life prediction based on interpretable deep learning and network parameter optimization,” Applied Energy, vol. 379, 124713, 2025, doi: 10.1016/j.apenergy.2024.124713.</w:t>
+        <w:t>Roman, D., Saxena, S., Robu, V., Pecht, M., Flynn, D., “Machine learning pipeline for battery state-of-health estimation,” Nature Machine Intelligence, vol. 3, 447-456, 2021, doi: 10.1038/s42256-021-00312-3.</w:t>
       </w:r>
     </w:p>
     <w:p>
@@ -18409,7 +18638,7 @@
           <w:rFonts w:ascii="Times New Roman" w:hAnsi="Times New Roman"/>
           <w:sz w:val="18"/>
         </w:rPr>
-        <w:t>Qiang, X., Liu, W., Lyu, Z., Ruan, H., Li, X., “A data-fusion-model method for state of health estimation of Li-ion battery packs based on partial charging curve,” Green Energy and Intelligent Transportation, vol. 3, 100169, 2024, doi: 10.1016/j.geits.2024.100169.</w:t>
+        <w:t>Zhao, J., Qu, X., Li, Y., Nan, J., Burke, A. F., “Real-time prediction of battery remaining useful life using hybrid-fusion deep neural networks,” Energy, vol. 328, 136618, 2025, doi: 10.1016/j.energy.2025.136618.</w:t>
       </w:r>
     </w:p>
     <w:p>
@@ -18430,7 +18659,7 @@
           <w:rFonts w:ascii="Times New Roman" w:hAnsi="Times New Roman"/>
           <w:sz w:val="18"/>
         </w:rPr>
-        <w:t>Lu, J., Xiong, R., Tian, J., Wang, C., Sun, F., “Deep learning to estimate lithium-ion battery state of health without additional degradation experiments,” Nature Communications, vol. 14, Art. no. 2760, 2023, doi: 10.1038/s41467-023-38458-w.</w:t>
+        <w:t>Zhou, K. Q., Qin, Y., Yuen, C., “Graph neural network-based lithium-ion battery state of health estimation using partial discharging curve,” Journal of Energy Storage, vol. 100, 113502, 2024, doi: 10.1016/j.est.2024.113502.</w:t>
       </w:r>
     </w:p>
     <w:p>
@@ -18451,7 +18680,7 @@
           <w:rFonts w:ascii="Times New Roman" w:hAnsi="Times New Roman"/>
           <w:sz w:val="18"/>
         </w:rPr>
-        <w:t>Yang, Y., “A machine-learning prediction method of lithium-ion battery life based on charge process for different applications,” Applied Energy, vol. 292, 116897, 2021, doi: 10.1016/j.apenergy.2021.116897.</w:t>
+        <w:t>Zhao, B., Zhang, W., Zhang, Y., Zhang, C., Zhang, C., Zhang, J., “Lithium-ion battery remaining useful life prediction based on interpretable deep learning and network parameter optimization,” Applied Energy, vol. 379, 124713, 2025, doi: 10.1016/j.apenergy.2024.124713.</w:t>
       </w:r>
     </w:p>
     <w:p>
@@ -18472,7 +18701,7 @@
           <w:rFonts w:ascii="Times New Roman" w:hAnsi="Times New Roman"/>
           <w:sz w:val="18"/>
         </w:rPr>
-        <w:t>Fei, Z., Yang, F., Tsui, K. L., Li, L., Zhang, Z., “Early prediction of battery lifetime via a machine learning based framework,” Energy, vol. 225, 120205, 2021, doi: 10.1016/j.energy.2021.120205.</w:t>
+        <w:t>Qiang, X., Liu, W., Lyu, Z., Ruan, H., Li, X., “A data-fusion-model method for state of health estimation of Li-ion battery packs based on partial charging curve,” Green Energy and Intelligent Transportation, vol. 3, 100169, 2024, doi: 10.1016/j.geits.2024.100169.</w:t>
       </w:r>
     </w:p>
     <w:p>
@@ -18493,7 +18722,7 @@
           <w:rFonts w:ascii="Times New Roman" w:hAnsi="Times New Roman"/>
           <w:sz w:val="18"/>
         </w:rPr>
-        <w:t>Tong, Z., Miao, J., Tong, S., Lu, Y., “Early prediction of remaining useful life for Lithium-ion batteries based on a hybrid machine learning method,” Journal of Cleaner Production, vol. 317, 128265, 2021, doi: 10.1016/j.jclepro.2021.128265.</w:t>
+        <w:t>Lu, J., Xiong, R., Tian, J., Wang, C., Sun, F., “Deep learning to estimate lithium-ion battery state of health without additional degradation experiments,” Nature Communications, vol. 14, Art. no. 2760, 2023, doi: 10.1038/s41467-023-38458-w.</w:t>
       </w:r>
     </w:p>
     <w:p>
@@ -18514,7 +18743,7 @@
           <w:rFonts w:ascii="Times New Roman" w:hAnsi="Times New Roman"/>
           <w:sz w:val="18"/>
         </w:rPr>
-        <w:t>Si, Q., Matsuda, S., Yamaji, Y., Momma, T., Tateyama, Y., “Data‐Driven Cycle Life Prediction of Lithium Metal‐Based Rechargeable Battery Based on Discharge/Charge Capacity and Relaxation Features,” Advanced Science, vol. 11, Art. no. 2402608, 2024, doi: 10.1002/advs.202402608.</w:t>
+        <w:t>Yang, Y., “A machine-learning prediction method of lithium-ion battery life based on charge process for different applications,” Applied Energy, vol. 292, 116897, 2021, doi: 10.1016/j.apenergy.2021.116897.</w:t>
       </w:r>
     </w:p>
     <w:p>
@@ -18535,7 +18764,7 @@
           <w:rFonts w:ascii="Times New Roman" w:hAnsi="Times New Roman"/>
           <w:sz w:val="18"/>
         </w:rPr>
-        <w:t>Zhao, S., Zhang, C., Wang, Y., “Lithium-ion battery capacity and remaining useful life prediction using board learning system and long short-term memory neural network,” Journal of Energy Storage, vol. 52, 104901, 2022, doi: 10.1016/j.est.2022.104901.</w:t>
+        <w:t>Fei, Z., Yang, F., Tsui, K. L., Li, L., Zhang, Z., “Early prediction of battery lifetime via a machine learning based framework,” Energy, vol. 225, 120205, 2021, doi: 10.1016/j.energy.2021.120205.</w:t>
       </w:r>
     </w:p>
     <w:p>
@@ -18556,7 +18785,7 @@
           <w:rFonts w:ascii="Times New Roman" w:hAnsi="Times New Roman"/>
           <w:sz w:val="18"/>
         </w:rPr>
-        <w:t>Shi, J., Rivera, A., Wu, D., “Battery health management using physics-informed machine learning: Online degradation modeling and remaining useful life prediction,” Mechanical Systems and Signal Processing, vol. 179, 109347, 2022, doi: 10.1016/j.ymssp.2022.109347.</w:t>
+        <w:t>Tong, Z., Miao, J., Tong, S., Lu, Y., “Early prediction of remaining useful life for Lithium-ion batteries based on a hybrid machine learning method,” Journal of Cleaner Production, vol. 317, 128265, 2021, doi: 10.1016/j.jclepro.2021.128265.</w:t>
       </w:r>
     </w:p>
     <w:p>
@@ -18577,7 +18806,7 @@
           <w:rFonts w:ascii="Times New Roman" w:hAnsi="Times New Roman"/>
           <w:sz w:val="18"/>
         </w:rPr>
-        <w:t>Salem, N. M., Mohamed, A., “Physics-informed hybrid reinforcement learning for estimating lithium-ion battery state of health,” Scientific Reports, vol. 15, Art. no. 43819, 2025, doi: 10.1038/s41598-025-30602-4.</w:t>
+        <w:t>Si, Q., Matsuda, S., Yamaji, Y., Momma, T., Tateyama, Y., “Data‐Driven Cycle Life Prediction of Lithium Metal‐Based Rechargeable Battery Based on Discharge/Charge Capacity and Relaxation Features,” Advanced Science, vol. 11, Art. no. 2402608, 2024, doi: 10.1002/advs.202402608.</w:t>
       </w:r>
     </w:p>
     <w:p>
@@ -18598,7 +18827,7 @@
           <w:rFonts w:ascii="Times New Roman" w:hAnsi="Times New Roman"/>
           <w:sz w:val="18"/>
         </w:rPr>
-        <w:t>Wang, S., Zhou, R., Ren, Y., Liu, H., Lin, Y., Lian, C., “A generalizable physics-informed neural network for lithium-ion battery SOH estimation utilizing partial charging segments,” Journal of Energy Chemistry, vol. 112, 977-986, 2026, doi: 10.1016/j.jechem.2025.08.093.</w:t>
+        <w:t>Zhao, S., Zhang, C., Wang, Y., “Lithium-ion battery capacity and remaining useful life prediction using board learning system and long short-term memory neural network,” Journal of Energy Storage, vol. 52, 104901, 2022, doi: 10.1016/j.est.2022.104901.</w:t>
       </w:r>
     </w:p>
     <w:p>
@@ -18619,7 +18848,7 @@
           <w:rFonts w:ascii="Times New Roman" w:hAnsi="Times New Roman"/>
           <w:sz w:val="18"/>
         </w:rPr>
-        <w:t>Gao, K., Li, Q., Hu, L., Huang, J., Li, H., Wu, Y., “Physical informed neural network for SOH estimation of lithium-ion battery with electrochemical mechanism,” Energy, vol. 342, 139753, 2026, doi: 10.1016/j.energy.2025.139753.</w:t>
+        <w:t>Shi, J., Rivera, A., Wu, D., “Battery health management using physics-informed machine learning: Online degradation modeling and remaining useful life prediction,” Mechanical Systems and Signal Processing, vol. 179, 109347, 2022, doi: 10.1016/j.ymssp.2022.109347.</w:t>
       </w:r>
     </w:p>
     <w:p>
@@ -18640,7 +18869,7 @@
           <w:rFonts w:ascii="Times New Roman" w:hAnsi="Times New Roman"/>
           <w:sz w:val="18"/>
         </w:rPr>
-        <w:t>Deng, W., Le, H., Nguyen, K. T., Gogu, C., Medjaher, K., Morio, J., et al., “A generic physics-informed machine learning framework for battery remaining useful life prediction using small early-stage lifecycle data,” Applied Energy, vol. 384, 125314, 2025, doi: 10.1016/j.apenergy.2025.125314.</w:t>
+        <w:t>Salem, N. M., Mohamed, A., “Physics-informed hybrid reinforcement learning for estimating lithium-ion battery state of health,” Scientific Reports, vol. 15, Art. no. 43819, 2025, doi: 10.1038/s41598-025-30602-4.</w:t>
       </w:r>
     </w:p>
     <w:p>
@@ -18661,7 +18890,7 @@
           <w:rFonts w:ascii="Times New Roman" w:hAnsi="Times New Roman"/>
           <w:sz w:val="18"/>
         </w:rPr>
-        <w:t>Qi, Y., Wang, J., Lu, H., Chu, H., Chen, D., Jin, J., “Remaining useful life prediction for lithium-ion battery based on hybrid machine learning with Wiener process,” Journal of Energy Storage, vol. 136, 118415, 2025, doi: 10.1016/j.est.2025.118415.</w:t>
+        <w:t>Wang, S., Zhou, R., Ren, Y., Liu, H., Lin, Y., Lian, C., “A generalizable physics-informed neural network for lithium-ion battery SOH estimation utilizing partial charging segments,” Journal of Energy Chemistry, vol. 112, 977-986, 2026, doi: 10.1016/j.jechem.2025.08.093.</w:t>
       </w:r>
     </w:p>
     <w:p>
@@ -18682,7 +18911,7 @@
           <w:rFonts w:ascii="Times New Roman" w:hAnsi="Times New Roman"/>
           <w:sz w:val="18"/>
         </w:rPr>
-        <w:t>Fan, Y., Lin, Z., Wang, F., Zhang, J., “A hybrid approach for lithium-ion battery remaining useful life prediction using signal decomposition and machine learning,” Scientific Reports, vol. 15, Art. no. 8161, 2025, doi: 10.1038/s41598-025-92262-8.</w:t>
+        <w:t>Gao, K., Li, Q., Hu, L., Huang, J., Li, H., Wu, Y., “Physical informed neural network for SOH estimation of lithium-ion battery with electrochemical mechanism,” Energy, vol. 342, 139753, 2026, doi: 10.1016/j.energy.2025.139753.</w:t>
       </w:r>
     </w:p>
     <w:p>
@@ -18703,7 +18932,7 @@
           <w:rFonts w:ascii="Times New Roman" w:hAnsi="Times New Roman"/>
           <w:sz w:val="18"/>
         </w:rPr>
-        <w:t>Zhao, J., Li, D., Li, Y., Shi, D., Nan, J., Burke, A. F., “Battery state of health estimation under fast charging via deep transfer learning,” iScience, vol. 28, 112235, 2025, doi: 10.1016/j.isci.2025.112235.</w:t>
+        <w:t>Deng, W., Le, H., Nguyen, K. T., Gogu, C., Medjaher, K., Morio, J., et al., “A generic physics-informed machine learning framework for battery remaining useful life prediction using small early-stage lifecycle data,” Applied Energy, vol. 384, 125314, 2025, doi: 10.1016/j.apenergy.2025.125314.</w:t>
       </w:r>
     </w:p>
     <w:p>
@@ -18724,7 +18953,7 @@
           <w:rFonts w:ascii="Times New Roman" w:hAnsi="Times New Roman"/>
           <w:sz w:val="18"/>
         </w:rPr>
-        <w:t>Lin, M., Hu, D., Meng, J., Wu, J., “Transfer Learning-Based Lithium-Ion Battery State of Health Estimation With Electrochemical Impedance Spectroscopy,” IEEE Transactions on Transportation Electrification, vol. 11, 7910-7920, 2025, doi: 10.1109/tte.2025.3533540.</w:t>
+        <w:t>Qi, Y., Wang, J., Lu, H., Chu, H., Chen, D., Jin, J., “Remaining useful life prediction for lithium-ion battery based on hybrid machine learning with Wiener process,” Journal of Energy Storage, vol. 136, 118415, 2025, doi: 10.1016/j.est.2025.118415.</w:t>
       </w:r>
     </w:p>
     <w:p>
@@ -18745,7 +18974,7 @@
           <w:rFonts w:ascii="Times New Roman" w:hAnsi="Times New Roman"/>
           <w:sz w:val="18"/>
         </w:rPr>
-        <w:t>Cao, Z., Gao, W., Fu, Y., Kurdkandi, N. V., Mi, C., “A general framework for lithium-ion battery state of health estimation: From laboratory tests to machine learning with transferability across domains,” Applied Energy, vol. 381, 125086, 2025, doi: 10.1016/j.apenergy.2024.125086.</w:t>
+        <w:t>Fan, Y., Lin, Z., Wang, F., Zhang, J., “A hybrid approach for lithium-ion battery remaining useful life prediction using signal decomposition and machine learning,” Scientific Reports, vol. 15, Art. no. 8161, 2025, doi: 10.1038/s41598-025-92262-8.</w:t>
       </w:r>
     </w:p>
     <w:p>
@@ -18766,7 +18995,7 @@
           <w:rFonts w:ascii="Times New Roman" w:hAnsi="Times New Roman"/>
           <w:sz w:val="18"/>
         </w:rPr>
-        <w:t>Sun, R., Chen, J., Piao, C., “Battery health features extraction and state of health estimation based on real-time online vehicle driving data,” Journal of Power Sources, vol. 645, 236784, 2025, doi: 10.1016/j.jpowsour.2025.236784.</w:t>
+        <w:t>Zhao, J., Li, D., Li, Y., Shi, D., Nan, J., Burke, A. F., “Battery state of health estimation under fast charging via deep transfer learning,” iScience, vol. 28, 112235, 2025, doi: 10.1016/j.isci.2025.112235.</w:t>
       </w:r>
     </w:p>
     <w:p>
@@ -18787,7 +19016,7 @@
           <w:rFonts w:ascii="Times New Roman" w:hAnsi="Times New Roman"/>
           <w:sz w:val="18"/>
         </w:rPr>
-        <w:t>Cheng, F., Liu, H., “Charging strategies optimization for lithium-ion battery: Heterogeneous ensemble surrogate model-assisted advanced multi-objective optimization algorithm,” Energy Conversion and Management, vol. 342, 120170, 2025, doi: 10.1016/j.enconman.2025.120170.</w:t>
+        <w:t>Lin, M., Hu, D., Meng, J., Wu, J., “Transfer Learning-Based Lithium-Ion Battery State of Health Estimation With Electrochemical Impedance Spectroscopy,” IEEE Transactions on Transportation Electrification, vol. 11, 7910-7920, 2025, doi: 10.1109/tte.2025.3533540.</w:t>
       </w:r>
     </w:p>
     <w:p>
@@ -18808,7 +19037,7 @@
           <w:rFonts w:ascii="Times New Roman" w:hAnsi="Times New Roman"/>
           <w:sz w:val="18"/>
         </w:rPr>
-        <w:t>Dong, G., Feng, Y., Lou, Y., Zhang, M., Wei, J., “Data-Driven Fast Charging Optimization for Lithium-Ion Battery Using Bayesian Optimization With Fast Convergence,” IEEE Transactions on Transportation Electrification, vol. 10, 4173-4183, 2024, doi: 10.1109/tte.2023.3311813.</w:t>
+        <w:t>Cao, Z., Gao, W., Fu, Y., Kurdkandi, N. V., Mi, C., “A general framework for lithium-ion battery state of health estimation: From laboratory tests to machine learning with transferability across domains,” Applied Energy, vol. 381, 125086, 2025, doi: 10.1016/j.apenergy.2024.125086.</w:t>
       </w:r>
     </w:p>
     <w:p>
@@ -18829,7 +19058,7 @@
           <w:rFonts w:ascii="Times New Roman" w:hAnsi="Times New Roman"/>
           <w:sz w:val="18"/>
         </w:rPr>
-        <w:t>Wei, Z., Yang, X., Li, Y., He, H., Li, W., Sauer, D. U., “Machine learning-based fast charging of lithium-ion battery by perceiving and regulating internal microscopic states,” Energy Storage Materials, vol. 56, 62-75, 2023, doi: 10.1016/j.ensm.2022.12.034.</w:t>
+        <w:t>Sun, R., Chen, J., Piao, C., “Battery health features extraction and state of health estimation based on real-time online vehicle driving data,” Journal of Power Sources, vol. 645, 236784, 2025, doi: 10.1016/j.jpowsour.2025.236784.</w:t>
       </w:r>
     </w:p>
     <w:p>
@@ -18850,7 +19079,7 @@
           <w:rFonts w:ascii="Times New Roman" w:hAnsi="Times New Roman"/>
           <w:sz w:val="18"/>
         </w:rPr>
-        <w:t>Li, Y., Li, K., Xie, Y., Liu, J., Fu, C., Liu, B., “Optimized charging of lithium-ion battery for electric vehicles: Adaptive multistage constant current–constant voltage charging strategy,” Renewable Energy, vol. 146, 2688-2699, 2020, doi: 10.1016/j.renene.2019.08.077.</w:t>
+        <w:t>Cheng, F., Liu, H., “Charging strategies optimization for lithium-ion battery: Heterogeneous ensemble surrogate model-assisted advanced multi-objective optimization algorithm,” Energy Conversion and Management, vol. 342, 120170, 2025, doi: 10.1016/j.enconman.2025.120170.</w:t>
       </w:r>
     </w:p>
     <w:p>
@@ -18871,7 +19100,7 @@
           <w:rFonts w:ascii="Times New Roman" w:hAnsi="Times New Roman"/>
           <w:sz w:val="18"/>
         </w:rPr>
-        <w:t>Fan, Z., Fu, Y., Liang, H., Gao, R., Liu, S., “A module-level charging optimization method of lithium-ion battery considering temperature gradient effect of liquid cooling and charging time,” Energy, vol. 265, 126331, 2023, doi: 10.1016/j.energy.2022.126331.</w:t>
+        <w:t>Dong, G., Feng, Y., Lou, Y., Zhang, M., Wei, J., “Data-Driven Fast Charging Optimization for Lithium-Ion Battery Using Bayesian Optimization With Fast Convergence,” IEEE Transactions on Transportation Electrification, vol. 10, 4173-4183, 2024, doi: 10.1109/tte.2023.3311813.</w:t>
       </w:r>
     </w:p>
     <w:p>
@@ -18892,7 +19121,7 @@
           <w:rFonts w:ascii="Times New Roman" w:hAnsi="Times New Roman"/>
           <w:sz w:val="18"/>
         </w:rPr>
-        <w:t>Heydarian Ardakani, A., Abdollahi, F., “A fast balance optimization approach for charging enhancement of lithium-ion battery packs through deep reinforcement learning,” Journal of Energy Storage, vol. 89, 111755, 2024, doi: 10.1016/j.est.2024.111755.</w:t>
+        <w:t>Wei, Z., Yang, X., Li, Y., He, H., Li, W., Sauer, D. U., “Machine learning-based fast charging of lithium-ion battery by perceiving and regulating internal microscopic states,” Energy Storage Materials, vol. 56, 62-75, 2023, doi: 10.1016/j.ensm.2022.12.034.</w:t>
       </w:r>
     </w:p>
     <w:p>
@@ -18913,7 +19142,7 @@
           <w:rFonts w:ascii="Times New Roman" w:hAnsi="Times New Roman"/>
           <w:sz w:val="18"/>
         </w:rPr>
-        <w:t>Duan, S., Xia, K., Li, J., Zhao, Z., Liu, H., “Optimization charging method of lithium-ion battery based on multi-objective BBO algorithm,” Journal of Energy Storage, vol. 91, 112046, 2024, doi: 10.1016/j.est.2024.112046.</w:t>
+        <w:t>Li, Y., Li, K., Xie, Y., Liu, J., Fu, C., Liu, B., “Optimized charging of lithium-ion battery for electric vehicles: Adaptive multistage constant current–constant voltage charging strategy,” Renewable Energy, vol. 146, 2688-2699, 2020, doi: 10.1016/j.renene.2019.08.077.</w:t>
       </w:r>
     </w:p>
     <w:p>
@@ -18934,7 +19163,7 @@
           <w:rFonts w:ascii="Times New Roman" w:hAnsi="Times New Roman"/>
           <w:sz w:val="18"/>
         </w:rPr>
-        <w:t>Wang, Y., Chen, X., Li, C., Yu, Y., Zhou, G., Wang, C., et al., “Temperature prediction of lithium-ion battery based on artificial neural network model,” Applied Thermal Engineering, vol. 228, 120482, 2023, doi: 10.1016/j.applthermaleng.2023.120482.</w:t>
+        <w:t>Fan, Z., Fu, Y., Liang, H., Gao, R., Liu, S., “A module-level charging optimization method of lithium-ion battery considering temperature gradient effect of liquid cooling and charging time,” Energy, vol. 265, 126331, 2023, doi: 10.1016/j.energy.2022.126331.</w:t>
       </w:r>
     </w:p>
     <w:p>
@@ -18955,7 +19184,7 @@
           <w:rFonts w:ascii="Times New Roman" w:hAnsi="Times New Roman"/>
           <w:sz w:val="18"/>
         </w:rPr>
-        <w:t>Zhou, X., Guo, W., Shi, X., She, C., Zheng, Z., Zhou, J., et al., “Machine learning assisted multi-objective design optimization for battery thermal management system,” Applied Thermal Engineering, vol. 253, 123826, 2024, doi: 10.1016/j.applthermaleng.2024.123826.</w:t>
+        <w:t>Heydarian Ardakani, A., Abdollahi, F., “A fast balance optimization approach for charging enhancement of lithium-ion battery packs through deep reinforcement learning,” Journal of Energy Storage, vol. 89, 111755, 2024, doi: 10.1016/j.est.2024.111755.</w:t>
       </w:r>
     </w:p>
     <w:p>
@@ -18976,7 +19205,7 @@
           <w:rFonts w:ascii="Times New Roman" w:hAnsi="Times New Roman"/>
           <w:sz w:val="18"/>
         </w:rPr>
-        <w:t>Yao, L., Fang, Z., Xiao, Y., Hou, J., Fu, Z., “An Intelligent Fault Diagnosis Method for Lithium Battery Systems Based on Grid Search Support Vector Machine,” Energy, vol. 214, 118866, 2021, doi: 10.1016/j.energy.2020.118866.</w:t>
+        <w:t>Duan, S., Xia, K., Li, J., Zhao, Z., Liu, H., “Optimization charging method of lithium-ion battery based on multi-objective BBO algorithm,” Journal of Energy Storage, vol. 91, 112046, 2024, doi: 10.1016/j.est.2024.112046.</w:t>
       </w:r>
     </w:p>
     <w:p>
@@ -18997,7 +19226,7 @@
           <w:rFonts w:ascii="Times New Roman" w:hAnsi="Times New Roman"/>
           <w:sz w:val="18"/>
         </w:rPr>
-        <w:t>Das Goswami, B. R., Abdisobbouhi, Y., Du, H., Mashayek, F., Kingston, T. A., Yurkiv, V., “Advancing battery safety: Integrating multiphysics and machine learning for thermal runaway prediction in lithium-ion battery module,” Journal of Power Sources, vol. 614, 235015, 2024, doi: 10.1016/j.jpowsour.2024.235015.</w:t>
+        <w:t>Wang, Y., Chen, X., Li, C., Yu, Y., Zhou, G., Wang, C., et al., “Temperature prediction of lithium-ion battery based on artificial neural network model,” Applied Thermal Engineering, vol. 228, 120482, 2023, doi: 10.1016/j.applthermaleng.2023.120482.</w:t>
       </w:r>
     </w:p>
     <w:p>
@@ -19018,7 +19247,7 @@
           <w:rFonts w:ascii="Times New Roman" w:hAnsi="Times New Roman"/>
           <w:sz w:val="18"/>
         </w:rPr>
-        <w:t>Dong, C., Sun, D., “Multi-source domain transfer learning with small sample learning for thermal runaway diagnosis of lithium-ion battery,” Applied Energy, vol. 365, 123248, 2024, doi: 10.1016/j.apenergy.2024.123248.</w:t>
+        <w:t>Zhou, X., Guo, W., Shi, X., She, C., Zheng, Z., Zhou, J., et al., “Machine learning assisted multi-objective design optimization for battery thermal management system,” Applied Thermal Engineering, vol. 253, 123826, 2024, doi: 10.1016/j.applthermaleng.2024.123826.</w:t>
       </w:r>
     </w:p>
     <w:p>
@@ -19039,7 +19268,7 @@
           <w:rFonts w:ascii="Times New Roman" w:hAnsi="Times New Roman"/>
           <w:sz w:val="18"/>
         </w:rPr>
-        <w:t>Rieger, L. H., Flores, E., Nielsen, K. F., Norby, P., Ayerbe, E., Winther, O., et al., “Uncertainty-aware and explainable machine learning for early prediction of battery degradation trajectory,” Digital Discovery, vol. 2, 112-122, 2023, doi: 10.1039/d2dd00067a.</w:t>
+        <w:t>Yao, L., Fang, Z., Xiao, Y., Hou, J., Fu, Z., “An Intelligent Fault Diagnosis Method for Lithium Battery Systems Based on Grid Search Support Vector Machine,” Energy, vol. 214, 118866, 2021, doi: 10.1016/j.energy.2020.118866.</w:t>
       </w:r>
     </w:p>
     <w:p>
@@ -19060,7 +19289,7 @@
           <w:rFonts w:ascii="Times New Roman" w:hAnsi="Times New Roman"/>
           <w:sz w:val="18"/>
         </w:rPr>
-        <w:t>Poh, W. Q. T., Xu, Y., Tan, R. T. P., “Data-Driven Estimation of Li-Ion Battery Health: Integrating GPT-4 With Distilled Lifelong Learning,” IEEE Transactions on Energy Conversion, vol. 40, 1682-1685, 2025, doi: 10.1109/tec.2025.3548400.</w:t>
+        <w:t>Das Goswami, B. R., Abdisobbouhi, Y., Du, H., Mashayek, F., Kingston, T. A., Yurkiv, V., “Advancing battery safety: Integrating multiphysics and machine learning for thermal runaway prediction in lithium-ion battery module,” Journal of Power Sources, vol. 614, 235015, 2024, doi: 10.1016/j.jpowsour.2024.235015.</w:t>
       </w:r>
     </w:p>
     <w:p>
@@ -19081,7 +19310,7 @@
           <w:rFonts w:ascii="Times New Roman" w:hAnsi="Times New Roman"/>
           <w:sz w:val="18"/>
         </w:rPr>
-        <w:t>Si, Y., Zhou, X., Wang, Y., Zhang, T., Xiao, Y., Liu, Y., “Internal temperature sensing for lithium-ion battery under ultrahigh-rate discharge conditions using physics-informed neural network,” Applied Energy, vol. 408, 127394, 2026, doi: 10.1016/j.apenergy.2026.127394.</w:t>
+        <w:t>Dong, C., Sun, D., “Multi-source domain transfer learning with small sample learning for thermal runaway diagnosis of lithium-ion battery,” Applied Energy, vol. 365, 123248, 2024, doi: 10.1016/j.apenergy.2024.123248.</w:t>
       </w:r>
     </w:p>
     <w:p>
@@ -19102,7 +19331,7 @@
           <w:rFonts w:ascii="Times New Roman" w:hAnsi="Times New Roman"/>
           <w:sz w:val="18"/>
         </w:rPr>
-        <w:t>Tang, X., Guo, Q., Li, M., Wei, C., Pan, Z., Wang, Y., “Performance analysis on liquid-cooled battery thermal management for electric vehicles based on machine learning,” Journal of Power Sources, vol. 494, 229727, 2021, doi: 10.1016/j.jpowsour.2021.229727.</w:t>
+        <w:t>Rieger, L. H., Flores, E., Nielsen, K. F., Norby, P., Ayerbe, E., Winther, O., et al., “Uncertainty-aware and explainable machine learning for early prediction of battery degradation trajectory,” Digital Discovery, vol. 2, 112-122, 2023, doi: 10.1039/d2dd00067a.</w:t>
       </w:r>
     </w:p>
     <w:p>
@@ -19123,7 +19352,7 @@
           <w:rFonts w:ascii="Times New Roman" w:hAnsi="Times New Roman"/>
           <w:sz w:val="18"/>
         </w:rPr>
-        <w:t>Chen, S., Zhang, G., Zhu, J., Feng, X., Wei, X., Ouyang, M., et al., “Multi-objective optimization design and experimental investigation for a parallel liquid cooling-based Lithium-ion battery module under fast charging,” Applied Thermal Engineering, vol. 211, 118503, 2022, doi: 10.1016/j.applthermaleng.2022.118503.</w:t>
+        <w:t>Poh, W. Q. T., Xu, Y., Tan, R. T. P., “Data-Driven Estimation of Li-Ion Battery Health: Integrating GPT-4 With Distilled Lifelong Learning,” IEEE Transactions on Energy Conversion, vol. 40, 1682-1685, 2025, doi: 10.1109/tec.2025.3548400.</w:t>
       </w:r>
     </w:p>
     <w:p>
@@ -19144,7 +19373,7 @@
           <w:rFonts w:ascii="Times New Roman" w:hAnsi="Times New Roman"/>
           <w:sz w:val="18"/>
         </w:rPr>
-        <w:t>Nam, K., Ahn, C., “Energy-Efficient Battery Thermal Management in Electric Vehicles Using Artificial-Neural-Network-Based Model Predictive Control,” World Electric Vehicle Journal, vol. 16, 279, 2025, doi: 10.3390/wevj16050279.</w:t>
+        <w:t>Si, Y., Zhou, X., Wang, Y., Zhang, T., Xiao, Y., Liu, Y., “Internal temperature sensing for lithium-ion battery under ultrahigh-rate discharge conditions using physics-informed neural network,” Applied Energy, vol. 408, 127394, 2026, doi: 10.1016/j.apenergy.2026.127394.</w:t>
       </w:r>
     </w:p>
     <w:p>
@@ -19165,7 +19394,7 @@
           <w:rFonts w:ascii="Times New Roman" w:hAnsi="Times New Roman"/>
           <w:sz w:val="18"/>
         </w:rPr>
-        <w:t>Zhang, C., Zhao, S., Yang, Z., He, Y., “A multi-fault diagnosis method for lithium-ion battery pack using curvilinear Manhattan distance evaluation and voltage difference analysis,” Journal of Energy Storage, vol. 67, 107575, 2023, doi: 10.1016/j.est.2023.107575.</w:t>
+        <w:t>Tang, X., Guo, Q., Li, M., Wei, C., Pan, Z., Wang, Y., “Performance analysis on liquid-cooled battery thermal management for electric vehicles based on machine learning,” Journal of Power Sources, vol. 494, 229727, 2021, doi: 10.1016/j.jpowsour.2021.229727.</w:t>
       </w:r>
     </w:p>
     <w:p>
@@ -19186,7 +19415,7 @@
           <w:rFonts w:ascii="Times New Roman" w:hAnsi="Times New Roman"/>
           <w:sz w:val="18"/>
         </w:rPr>
-        <w:t>Jia, Z., Wang, Z., Sun, Z., Sun, X., Liu, P., Ruzzenenti, F., “A multi-scenario data-driven approach for anomaly detection in electric vehicle battery systems,” eTransportation, vol. 24, 100418, 2025, doi: 10.1016/j.etran.2025.100418.</w:t>
+        <w:t>Chen, S., Zhang, G., Zhu, J., Feng, X., Wei, X., Ouyang, M., et al., “Multi-objective optimization design and experimental investigation for a parallel liquid cooling-based Lithium-ion battery module under fast charging,” Applied Thermal Engineering, vol. 211, 118503, 2022, doi: 10.1016/j.applthermaleng.2022.118503.</w:t>
       </w:r>
     </w:p>
     <w:p>
@@ -19207,7 +19436,7 @@
           <w:rFonts w:ascii="Times New Roman" w:hAnsi="Times New Roman"/>
           <w:sz w:val="18"/>
         </w:rPr>
-        <w:t>Huang, Y., Cai, H., Lai, X., Zheng, Y., Han, X., Ren, D., et al., “Deep learning-driven detection of lithium-plating-type defects for battery manufacturing via formation and capacity grading data,” Journal of Energy Chemistry, vol. 108, 536-549, 2025, doi: 10.1016/j.jechem.2025.04.025.</w:t>
+        <w:t>Nam, K., Ahn, C., “Energy-Efficient Battery Thermal Management in Electric Vehicles Using Artificial-Neural-Network-Based Model Predictive Control,” World Electric Vehicle Journal, vol. 16, 279, 2025, doi: 10.3390/wevj16050279.</w:t>
       </w:r>
     </w:p>
     <w:p>
@@ -19228,7 +19457,7 @@
           <w:rFonts w:ascii="Times New Roman" w:hAnsi="Times New Roman"/>
           <w:sz w:val="18"/>
         </w:rPr>
-        <w:t>Jeong, J., Kwak, E., Kim, J. h., Oh, K. Y., “Prediction of thermal runaway for a lithium-ion battery through multiphysics-informed DeepONet with virtual data,” eTransportation, vol. 21, 100337, 2024, doi: 10.1016/j.etran.2024.100337.</w:t>
+        <w:t>Zhang, C., Zhao, S., Yang, Z., He, Y., “A multi-fault diagnosis method for lithium-ion battery pack using curvilinear Manhattan distance evaluation and voltage difference analysis,” Journal of Energy Storage, vol. 67, 107575, 2023, doi: 10.1016/j.est.2023.107575.</w:t>
       </w:r>
     </w:p>
     <w:p>
@@ -19249,7 +19478,7 @@
           <w:rFonts w:ascii="Times New Roman" w:hAnsi="Times New Roman"/>
           <w:sz w:val="18"/>
         </w:rPr>
-        <w:t>He, L., Tian, A., Ding, T., Dong, K., Wang, Y., Gao, Y., et al., “Lithium-ion battery state estimation based on adaptive physics-informed neural network of electrochemical model,” Measurement, vol. 257, 118985, 2026, doi: 10.1016/j.measurement.2025.118985.</w:t>
+        <w:t>Jia, Z., Wang, Z., Sun, Z., Sun, X., Liu, P., Ruzzenenti, F., “A multi-scenario data-driven approach for anomaly detection in electric vehicle battery systems,” eTransportation, vol. 24, 100418, 2025, doi: 10.1016/j.etran.2025.100418.</w:t>
       </w:r>
     </w:p>
     <w:p>
@@ -19270,7 +19499,7 @@
           <w:rFonts w:ascii="Times New Roman" w:hAnsi="Times New Roman"/>
           <w:sz w:val="18"/>
         </w:rPr>
-        <w:t>Xu, Z., Guo, Y., Saleh, J. H., “A physics-informed dynamic deep autoencoder for accurate state-of-health prediction of lithium-ion battery,” Neural Computing and Applications, vol. 34, 15997-16017, 2022, doi: 10.1007/s00521-022-07291-5.</w:t>
+        <w:t>Huang, Y., Cai, H., Lai, X., Zheng, Y., Han, X., Ren, D., et al., “Deep learning-driven detection of lithium-plating-type defects for battery manufacturing via formation and capacity grading data,” Journal of Energy Chemistry, vol. 108, 536-549, 2025, doi: 10.1016/j.jechem.2025.04.025.</w:t>
       </w:r>
     </w:p>
     <w:p>
@@ -19291,7 +19520,7 @@
           <w:rFonts w:ascii="Times New Roman" w:hAnsi="Times New Roman"/>
           <w:sz w:val="18"/>
         </w:rPr>
-        <w:t>Lu, J., Xiong, R., Tian, J., Wang, C., Hsu, C. W., Tsou, N. T., et al., “Battery degradation prediction against uncertain future conditions with recurrent neural network enabled deep learning,” Energy Storage Materials, vol. 50, 139-151, 2022, doi: 10.1016/j.ensm.2022.05.007.</w:t>
+        <w:t>Jeong, J., Kwak, E., Kim, J. h., Oh, K. Y., “Prediction of thermal runaway for a lithium-ion battery through multiphysics-informed DeepONet with virtual data,” eTransportation, vol. 21, 100337, 2024, doi: 10.1016/j.etran.2024.100337.</w:t>
       </w:r>
     </w:p>
     <w:p>
@@ -19312,7 +19541,7 @@
           <w:rFonts w:ascii="Times New Roman" w:hAnsi="Times New Roman"/>
           <w:sz w:val="18"/>
         </w:rPr>
-        <w:t>Tao, J., Wang, S., Cao, W., Fernandez, C., Blaabjerg, F., “A Comprehensive Review of Multiple Physical and Data-Driven Model Fusion Methods for Accurate Lithium-Ion Battery Inner State Factor Estimation,” Batteries, vol. 10, 442, 2024, doi: 10.3390/batteries10120442.</w:t>
+        <w:t>He, L., Tian, A., Ding, T., Dong, K., Wang, Y., Gao, Y., et al., “Lithium-ion battery state estimation based on adaptive physics-informed neural network of electrochemical model,” Measurement, vol. 257, 118985, 2026, doi: 10.1016/j.measurement.2025.118985.</w:t>
       </w:r>
     </w:p>
     <w:p>
@@ -19333,7 +19562,7 @@
           <w:rFonts w:ascii="Times New Roman" w:hAnsi="Times New Roman"/>
           <w:sz w:val="18"/>
         </w:rPr>
-        <w:t>Wang, F., Zhao, Z., Zhai, Z., Shang, Z., Yan, R., Chen, X., “Explainability-driven model improvement for SOH estimation of lithium-ion battery,” Reliability Engineering &amp; System Safety, vol. 232, 109046, 2023, doi: 10.1016/j.ress.2022.109046.</w:t>
+        <w:t>Xu, Z., Guo, Y., Saleh, J. H., “A physics-informed dynamic deep autoencoder for accurate state-of-health prediction of lithium-ion battery,” Neural Computing and Applications, vol. 34, 15997-16017, 2022, doi: 10.1007/s00521-022-07291-5.</w:t>
       </w:r>
     </w:p>
     <w:p>
@@ -19354,7 +19583,7 @@
           <w:rFonts w:ascii="Times New Roman" w:hAnsi="Times New Roman"/>
           <w:sz w:val="18"/>
         </w:rPr>
-        <w:t>Liu, K., Niri, M. F., Apachitei, G., Lain, M., Greenwood, D., Marco, J., “Interpretable machine learning for battery capacities prediction and coating parameters analysis,” Control Engineering Practice, vol. 124, 105202, 2022, doi: 10.1016/j.conengprac.2022.105202.</w:t>
+        <w:t>Lu, J., Xiong, R., Tian, J., Wang, C., Hsu, C. W., Tsou, N. T., et al., “Battery degradation prediction against uncertain future conditions with recurrent neural network enabled deep learning,” Energy Storage Materials, vol. 50, 139-151, 2022, doi: 10.1016/j.ensm.2022.05.007.</w:t>
       </w:r>
     </w:p>
     <w:p>
@@ -19375,7 +19604,7 @@
           <w:rFonts w:ascii="Times New Roman" w:hAnsi="Times New Roman"/>
           <w:sz w:val="18"/>
         </w:rPr>
-        <w:t>Liu, X., Peng, H., Li, B., Chen, X., Li, Z., Huang, J., et al., “Untangling Degradation Chemistries of Lithium‐Sulfur Batteries Through Interpretable Hybrid Machine Learning,” Angewandte Chemie International Edition, vol. 61, Art. no. e202214037, 2022, doi: 10.1002/anie.202214037.</w:t>
+        <w:t>Tao, J., Wang, S., Cao, W., Fernandez, C., Blaabjerg, F., “A Comprehensive Review of Multiple Physical and Data-Driven Model Fusion Methods for Accurate Lithium-Ion Battery Inner State Factor Estimation,” Batteries, vol. 10, 442, 2024, doi: 10.3390/batteries10120442.</w:t>
       </w:r>
     </w:p>
     <w:p>
@@ -19396,7 +19625,7 @@
           <w:rFonts w:ascii="Times New Roman" w:hAnsi="Times New Roman"/>
           <w:sz w:val="18"/>
         </w:rPr>
-        <w:t>Eaty, N. D. K. M., Bagade, P., “Digital twin for electric vehicle battery management with incremental learning,” Expert Systems with Applications, vol. 229, 120444, 2023, doi: 10.1016/j.eswa.2023.120444.</w:t>
+        <w:t>Wang, F., Zhao, Z., Zhai, Z., Shang, Z., Yan, R., Chen, X., “Explainability-driven model improvement for SOH estimation of lithium-ion battery,” Reliability Engineering &amp; System Safety, vol. 232, 109046, 2023, doi: 10.1016/j.ress.2022.109046.</w:t>
       </w:r>
     </w:p>
     <w:p>
@@ -19417,7 +19646,7 @@
           <w:rFonts w:ascii="Times New Roman" w:hAnsi="Times New Roman"/>
           <w:sz w:val="18"/>
         </w:rPr>
-        <w:t>Yi, Y., Xia, C., Feng, C., Zhang, W., Fu, C., Qian, L., et al., “Digital twin-long short-term memory (LSTM) neural network based real-time temperature prediction and degradation model analysis for lithium-ion battery,” Journal of Energy Storage, vol. 64, 107203, 2023, doi: 10.1016/j.est.2023.107203.</w:t>
+        <w:t>Liu, K., Niri, M. F., Apachitei, G., Lain, M., Greenwood, D., Marco, J., “Interpretable machine learning for battery capacities prediction and coating parameters analysis,” Control Engineering Practice, vol. 124, 105202, 2022, doi: 10.1016/j.conengprac.2022.105202.</w:t>
       </w:r>
     </w:p>
     <w:p>
@@ -19438,7 +19667,7 @@
           <w:rFonts w:ascii="Times New Roman" w:hAnsi="Times New Roman"/>
           <w:sz w:val="18"/>
         </w:rPr>
-        <w:t>Zhang, Y., Zhao, M., “Cloud-based in-situ battery life prediction and classification using machine learning,” Energy Storage Materials, vol. 57, 346-359, 2023, doi: 10.1016/j.ensm.2023.02.035.</w:t>
+        <w:t>Liu, X., Peng, H., Li, B., Chen, X., Li, Z., Huang, J., et al., “Untangling Degradation Chemistries of Lithium‐Sulfur Batteries Through Interpretable Hybrid Machine Learning,” Angewandte Chemie International Edition, vol. 61, Art. no. e202214037, 2022, doi: 10.1002/anie.202214037.</w:t>
       </w:r>
     </w:p>
     <w:p>
@@ -19459,7 +19688,7 @@
           <w:rFonts w:ascii="Times New Roman" w:hAnsi="Times New Roman"/>
           <w:sz w:val="18"/>
         </w:rPr>
-        <w:t>Faraji-Niri, M., Rashid, M., Sansom, J., Sheikh, M., Widanage, D., Marco, J., “Accelerated state of health estimation of second life lithium-ion batteries via electrochemical impedance spectroscopy tests and machine learning techniques,” Journal of Energy Storage, vol. 58, 106295, 2023, doi: 10.1016/j.est.2022.106295.</w:t>
+        <w:t>Eaty, N. D. K. M., Bagade, P., “Digital twin for electric vehicle battery management with incremental learning,” Expert Systems with Applications, vol. 229, 120444, 2023, doi: 10.1016/j.eswa.2023.120444.</w:t>
       </w:r>
     </w:p>
     <w:p>
@@ -19480,7 +19709,7 @@
           <w:rFonts w:ascii="Times New Roman" w:hAnsi="Times New Roman"/>
           <w:sz w:val="18"/>
         </w:rPr>
-        <w:t>Zhang, Y., Tang, Q., Zhang, Y., Wang, J., Stimming, U., Lee, A. A., “Identifying degradation patterns of lithium ion batteries from impedance spectroscopy using machine learning,” Nature Communications, vol. 11, Art. no. 1706, 2020, doi: 10.1038/s41467-020-15235-7.</w:t>
+        <w:t>Yi, Y., Xia, C., Feng, C., Zhang, W., Fu, C., Qian, L., et al., “Digital twin-long short-term memory (LSTM) neural network based real-time temperature prediction and degradation model analysis for lithium-ion battery,” Journal of Energy Storage, vol. 64, 107203, 2023, doi: 10.1016/j.est.2023.107203.</w:t>
       </w:r>
     </w:p>
     <w:p>
@@ -19501,7 +19730,7 @@
           <w:rFonts w:ascii="Times New Roman" w:hAnsi="Times New Roman"/>
           <w:sz w:val="18"/>
         </w:rPr>
-        <w:t>Chen, J., Yao, Q., Kollmeyer, P., Vidal, C., Naguib, M., Panchal, S., et al., “Battery state-of-power estimation: A machine learning battery model with numerical searching approach,” Journal of Energy Storage, vol. 175, 123023, 2026, doi: 10.1016/j.est.2026.123023.</w:t>
+        <w:t>Zhang, Y., Zhao, M., “Cloud-based in-situ battery life prediction and classification using machine learning,” Energy Storage Materials, vol. 57, 346-359, 2023, doi: 10.1016/j.ensm.2023.02.035.</w:t>
       </w:r>
     </w:p>
     <w:p>
@@ -19522,7 +19751,7 @@
           <w:rFonts w:ascii="Times New Roman" w:hAnsi="Times New Roman"/>
           <w:sz w:val="18"/>
         </w:rPr>
-        <w:t>Haghi, S., Hidalgo, M. F. V., Niri, M. F., Daub, R., Marco, J., “Machine Learning in Lithium‐Ion Battery Cell Production: A Comprehensive Mapping Study,” Batteries &amp; Supercaps, vol. 6, Art. no. e202300046, 2023, doi: 10.1002/batt.202300046.</w:t>
+        <w:t>Faraji-Niri, M., Rashid, M., Sansom, J., Sheikh, M., Widanage, D., Marco, J., “Accelerated state of health estimation of second life lithium-ion batteries via electrochemical impedance spectroscopy tests and machine learning techniques,” Journal of Energy Storage, vol. 58, 106295, 2023, doi: 10.1016/j.est.2022.106295.</w:t>
       </w:r>
     </w:p>
     <w:p>
@@ -19543,7 +19772,133 @@
           <w:rFonts w:ascii="Times New Roman" w:hAnsi="Times New Roman"/>
           <w:sz w:val="18"/>
         </w:rPr>
+        <w:t>Zhang, Y., Tang, Q., Zhang, Y., Wang, J., Stimming, U., Lee, A. A., “Identifying degradation patterns of lithium ion batteries from impedance spectroscopy using machine learning,” Nature Communications, vol. 11, Art. no. 1706, 2020, doi: 10.1038/s41467-020-15235-7.</w:t>
+      </w:r>
+    </w:p>
+    <w:p>
+      <w:pPr>
+        <w:spacing w:after="60"/>
+        <w:ind w:left="360" w:hanging="360"/>
+        <w:jc w:val="both"/>
+      </w:pPr>
+      <w:r>
+        <w:rPr>
+          <w:rFonts w:ascii="Times New Roman" w:hAnsi="Times New Roman"/>
+          <w:sz w:val="18"/>
+        </w:rPr>
+        <w:t xml:space="preserve">120. </w:t>
+      </w:r>
+      <w:r>
+        <w:rPr>
+          <w:rFonts w:ascii="Times New Roman" w:hAnsi="Times New Roman"/>
+          <w:sz w:val="18"/>
+        </w:rPr>
+        <w:t>Chen, J., Yao, Q., Kollmeyer, P., Vidal, C., Naguib, M., Panchal, S., et al., “Battery state-of-power estimation: A machine learning battery model with numerical searching approach,” Journal of Energy Storage, vol. 175, 123023, 2026, doi: 10.1016/j.est.2026.123023.</w:t>
+      </w:r>
+    </w:p>
+    <w:p>
+      <w:pPr>
+        <w:spacing w:after="60"/>
+        <w:ind w:left="360" w:hanging="360"/>
+        <w:jc w:val="both"/>
+      </w:pPr>
+      <w:r>
+        <w:rPr>
+          <w:rFonts w:ascii="Times New Roman" w:hAnsi="Times New Roman"/>
+          <w:sz w:val="18"/>
+        </w:rPr>
+        <w:t xml:space="preserve">121. </w:t>
+      </w:r>
+      <w:r>
+        <w:rPr>
+          <w:rFonts w:ascii="Times New Roman" w:hAnsi="Times New Roman"/>
+          <w:sz w:val="18"/>
+        </w:rPr>
+        <w:t>Haghi, S., Hidalgo, M. F. V., Niri, M. F., Daub, R., Marco, J., “Machine Learning in Lithium‐Ion Battery Cell Production: A Comprehensive Mapping Study,” Batteries &amp; Supercaps, vol. 6, Art. no. e202300046, 2023, doi: 10.1002/batt.202300046.</w:t>
+      </w:r>
+    </w:p>
+    <w:p>
+      <w:pPr>
+        <w:spacing w:after="60"/>
+        <w:ind w:left="360" w:hanging="360"/>
+        <w:jc w:val="both"/>
+      </w:pPr>
+      <w:r>
+        <w:rPr>
+          <w:rFonts w:ascii="Times New Roman" w:hAnsi="Times New Roman"/>
+          <w:sz w:val="18"/>
+        </w:rPr>
+        <w:t xml:space="preserve">122. </w:t>
+      </w:r>
+      <w:r>
+        <w:rPr>
+          <w:rFonts w:ascii="Times New Roman" w:hAnsi="Times New Roman"/>
+          <w:sz w:val="18"/>
+        </w:rPr>
         <w:t>Nicodemo, N., Di Rienzo, R., Lagnoni, M., Bertei, A., Baronti, F., “Estimation of lithium-ion battery electrochemical properties from equivalent circuit model parameters using machine learning,” Journal of Energy Storage, vol. 99, 113257, 2024, doi: 10.1016/j.est.2024.113257.</w:t>
+      </w:r>
+    </w:p>
+    <w:p>
+      <w:pPr>
+        <w:spacing w:after="60"/>
+        <w:ind w:left="360" w:hanging="360"/>
+        <w:jc w:val="both"/>
+      </w:pPr>
+      <w:r>
+        <w:rPr>
+          <w:rFonts w:ascii="Times New Roman" w:hAnsi="Times New Roman"/>
+          <w:sz w:val="18"/>
+        </w:rPr>
+        <w:t xml:space="preserve">123. </w:t>
+      </w:r>
+      <w:r>
+        <w:rPr>
+          <w:rFonts w:ascii="Times New Roman" w:hAnsi="Times New Roman"/>
+          <w:sz w:val="18"/>
+        </w:rPr>
+        <w:t>UNECE Informal Working Group on Electric Vehicle Safety, “GTR No. 20 Electric vehicle safety: Proposal for Amendment 1 (thermal-propagation requirements with two compliance options),” UN ECE document EVS-30-C01/Rev.4, 2025. Proposal of 11 September 2025; listed for the WP.29 session of 17-20 November 2026. [Online]. Available: https://unece.org/transport/standards/transport/vehicle-regulations-wp29/global-technical-regulations-gtrs</w:t>
+      </w:r>
+    </w:p>
+    <w:p>
+      <w:pPr>
+        <w:spacing w:after="60"/>
+        <w:ind w:left="360" w:hanging="360"/>
+        <w:jc w:val="both"/>
+      </w:pPr>
+      <w:r>
+        <w:rPr>
+          <w:rFonts w:ascii="Times New Roman" w:hAnsi="Times New Roman"/>
+          <w:sz w:val="18"/>
+        </w:rPr>
+        <w:t xml:space="preserve">124. </w:t>
+      </w:r>
+      <w:r>
+        <w:rPr>
+          <w:rFonts w:ascii="Times New Roman" w:hAnsi="Times New Roman"/>
+          <w:sz w:val="18"/>
+        </w:rPr>
+        <w:t>International Organization for Standardization, “Road vehicles — Safety and artificial intelligence,” ISO/PAS 8800:2024, 2024. Published December 2024. [Online]. Available: https://www.iso.org/standard/83303.html</w:t>
+      </w:r>
+    </w:p>
+    <w:p>
+      <w:pPr>
+        <w:spacing w:after="60"/>
+        <w:ind w:left="360" w:hanging="360"/>
+        <w:jc w:val="both"/>
+      </w:pPr>
+      <w:r>
+        <w:rPr>
+          <w:rFonts w:ascii="Times New Roman" w:hAnsi="Times New Roman"/>
+          <w:sz w:val="18"/>
+        </w:rPr>
+        <w:t xml:space="preserve">125. </w:t>
+      </w:r>
+      <w:r>
+        <w:rPr>
+          <w:rFonts w:ascii="Times New Roman" w:hAnsi="Times New Roman"/>
+          <w:sz w:val="18"/>
+        </w:rPr>
+        <w:t>International Organization for Standardization, “Road vehicles — Safety of the intended functionality,” ISO 21448:2022, 2022.</w:t>
       </w:r>
     </w:p>
     <w:sectPr>

</xml_diff>